<commit_message>
Atualiza gerar_relatorio_word.py para incluir espaço reservado para a capa no início do documento. Melhora a lógica de preenchimento de células de fotos, garantindo que células vazias sejam limpas adequadamente. Modifica a interface em main.py para tornar os botões de adicionar e excluir mais descritivos.
</commit_message>
<xml_diff>
--- a/modelos/relatorio_modelo.docx
+++ b/modelos/relatorio_modelo.docx
@@ -312,6 +312,7 @@
           <w:ilvl w:val="0"/>
           <w:numId w:val="2"/>
         </w:numPr>
+        <w:spacing w:line="240" w:lineRule="auto"/>
       </w:pPr>
       <w:bookmarkStart w:id="1" w:name="_heading=h.4bvk7pj" w:colFirst="0" w:colLast="0"/>
       <w:bookmarkStart w:id="2" w:name="_heading=h.2r0uhxc" w:colFirst="0" w:colLast="0"/>
@@ -1646,7 +1647,6 @@
               <w:pStyle w:val="Legenda"/>
             </w:pPr>
             <w:r>
-              <w:lastRenderedPageBreak/>
               <w:t xml:space="preserve">Foto </w:t>
             </w:r>
             <w:r>
@@ -1796,7 +1796,6 @@
               <w:rPr>
                 <w:noProof/>
               </w:rPr>
-              <w:lastRenderedPageBreak/>
               <w:drawing>
                 <wp:inline distT="0" distB="0" distL="0" distR="0" wp14:anchorId="3865D566" wp14:editId="35B87AC1">
                   <wp:extent cx="2667000" cy="1917700"/>
@@ -1839,7 +1838,6 @@
               <w:pStyle w:val="Legenda"/>
             </w:pPr>
             <w:r>
-              <w:lastRenderedPageBreak/>
               <w:t xml:space="preserve">Foto </w:t>
             </w:r>
             <w:r>
@@ -15625,13 +15623,19 @@
   </w:compat>
   <w:rsids>
     <w:rsidRoot w:val="00777EF8"/>
+    <w:rsid w:val="004F7115"/>
     <w:rsid w:val="00544863"/>
+    <w:rsid w:val="005D3323"/>
     <w:rsid w:val="00777EF8"/>
     <w:rsid w:val="00820C96"/>
+    <w:rsid w:val="00990D8F"/>
+    <w:rsid w:val="00A54E8F"/>
     <w:rsid w:val="00C24D31"/>
     <w:rsid w:val="00C42C71"/>
+    <w:rsid w:val="00C9731F"/>
     <w:rsid w:val="00CF03B8"/>
     <w:rsid w:val="00E70214"/>
+    <w:rsid w:val="00EA697A"/>
     <w:rsid w:val="00F25951"/>
   </w:rsids>
   <m:mathPr>
@@ -16488,28 +16492,28 @@
 </file>
 
 <file path=customXml/item1.xml><?xml version="1.0" encoding="utf-8"?>
+<b:Sources xmlns:b="http://schemas.openxmlformats.org/officeDocument/2006/bibliography" xmlns="http://schemas.openxmlformats.org/officeDocument/2006/bibliography" SelectedStyle="\APASixthEditionOfficeOnline.xsl" StyleName="APA" Version="6"/>
+</file>
+
+<file path=customXml/item2.xml><?xml version="1.0" encoding="utf-8"?>
 <go:gDocsCustomXmlDataStorage xmlns:go="http://customooxmlschemas.google.com/" xmlns:r="http://schemas.openxmlformats.org/officeDocument/2006/relationships">
   <go:docsCustomData xmlns:go="http://customooxmlschemas.google.com/" roundtripDataSignature="AMtx7mireC5jhx61ZFx9QXGA77WyrFMjeQ==">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</go:docsCustomData>
 </go:gDocsCustomXmlDataStorage>
 </file>
 
-<file path=customXml/item2.xml><?xml version="1.0" encoding="utf-8"?>
-<b:Sources xmlns:b="http://schemas.openxmlformats.org/officeDocument/2006/bibliography" xmlns="http://schemas.openxmlformats.org/officeDocument/2006/bibliography" SelectedStyle="\APASixthEditionOfficeOnline.xsl" StyleName="APA" Version="6"/>
+<file path=customXml/itemProps1.xml><?xml version="1.0" encoding="utf-8"?>
+<ds:datastoreItem xmlns:ds="http://schemas.openxmlformats.org/officeDocument/2006/customXml" ds:itemID="{ECDF6E07-8575-48BF-9B74-55682B433C56}">
+  <ds:schemaRefs>
+    <ds:schemaRef ds:uri="http://schemas.openxmlformats.org/officeDocument/2006/bibliography"/>
+  </ds:schemaRefs>
+</ds:datastoreItem>
 </file>
 
-<file path=customXml/itemProps1.xml><?xml version="1.0" encoding="utf-8"?>
+<file path=customXml/itemProps2.xml><?xml version="1.0" encoding="utf-8"?>
 <ds:datastoreItem xmlns:ds="http://schemas.openxmlformats.org/officeDocument/2006/customXml" ds:itemID="{11111111-1234-1234-1234-123412341234}">
   <ds:schemaRefs>
     <ds:schemaRef ds:uri="http://customooxmlschemas.google.com/"/>
     <ds:schemaRef ds:uri="http://schemas.openxmlformats.org/officeDocument/2006/relationships"/>
   </ds:schemaRefs>
 </ds:datastoreItem>
-</file>
-
-<file path=customXml/itemProps2.xml><?xml version="1.0" encoding="utf-8"?>
-<ds:datastoreItem xmlns:ds="http://schemas.openxmlformats.org/officeDocument/2006/customXml" ds:itemID="{ECDF6E07-8575-48BF-9B74-55682B433C56}">
-  <ds:schemaRefs>
-    <ds:schemaRef ds:uri="http://schemas.openxmlformats.org/officeDocument/2006/bibliography"/>
-  </ds:schemaRefs>
-</ds:datastoreItem>
 </file>
</xml_diff>

<commit_message>
Ajustes na leitura de modelos
</commit_message>
<xml_diff>
--- a/modelos/relatorio_modelo.docx
+++ b/modelos/relatorio_modelo.docx
@@ -310,7 +310,7 @@
         <w:pStyle w:val="Ttulo1"/>
         <w:numPr>
           <w:ilvl w:val="0"/>
-          <w:numId w:val="2"/>
+          <w:numId w:val="34"/>
         </w:numPr>
         <w:spacing w:line="240" w:lineRule="auto"/>
       </w:pPr>
@@ -391,6 +391,11 @@
     <w:p>
       <w:pPr>
         <w:pStyle w:val="Ttulo2"/>
+        <w:numPr>
+          <w:ilvl w:val="1"/>
+          <w:numId w:val="34"/>
+        </w:numPr>
+        <w:ind w:left="1134" w:hanging="850"/>
       </w:pPr>
       <w:bookmarkStart w:id="34" w:name="_Toc146026488"/>
       <w:bookmarkStart w:id="35" w:name="_Toc230935575"/>
@@ -2741,23 +2746,20 @@
     </w:tbl>
     <w:p/>
     <w:p>
+      <w:pPr>
+        <w:pStyle w:val="Ttulo2"/>
+        <w:numPr>
+          <w:ilvl w:val="1"/>
+          <w:numId w:val="34"/>
+        </w:numPr>
+        <w:ind w:left="1134" w:hanging="850"/>
+      </w:pPr>
       <w:r>
-        <w:br w:type="page"/>
-      </w:r>
-    </w:p>
-    <w:p>
-      <w:pPr>
-        <w:pStyle w:val="Ttulo2"/>
-      </w:pPr>
-      <w:bookmarkStart w:id="44" w:name="_Toc230935576"/>
-      <w:r>
-        <w:lastRenderedPageBreak/>
         <w:t>BLOCO 0</w:t>
       </w:r>
       <w:r>
         <w:t>2</w:t>
       </w:r>
-      <w:bookmarkEnd w:id="44"/>
     </w:p>
     <w:tbl>
       <w:tblPr>
@@ -2791,10 +2793,10 @@
                 <w:noProof/>
               </w:rPr>
               <w:drawing>
-                <wp:inline distT="0" distB="0" distL="0" distR="0" wp14:anchorId="03948E52" wp14:editId="752491D7">
+                <wp:inline distT="0" distB="0" distL="0" distR="0" wp14:anchorId="08569880" wp14:editId="7D252DAE">
                   <wp:extent cx="2667000" cy="1917700"/>
                   <wp:effectExtent l="0" t="0" r="0" b="6350"/>
-                  <wp:docPr id="526664100" name="Imagem 526664100"/>
+                  <wp:docPr id="1876593140" name="Imagem 1876593140"/>
                   <wp:cNvGraphicFramePr>
                     <a:graphicFrameLocks xmlns:a="http://schemas.openxmlformats.org/drawingml/2006/main"/>
                   </wp:cNvGraphicFramePr>
@@ -2856,7 +2858,7 @@
               <w:rPr>
                 <w:noProof/>
               </w:rPr>
-              <w:t>13</w:t>
+              <w:t>1</w:t>
             </w:r>
             <w:r>
               <w:rPr>
@@ -2875,9 +2877,9 @@
                 <w:rPr>
                   <w:noProof/>
                 </w:rPr>
-                <w:id w:val="605617809"/>
+                <w:id w:val="328949280"/>
                 <w:placeholder>
-                  <w:docPart w:val="C01BA29ABC29466688E938D784992E30"/>
+                  <w:docPart w:val="5833024B207F4EFD8792C8948A368941"/>
                 </w:placeholder>
                 <w:comboBox>
                   <w:listItem w:displayText="Armadura exposta" w:value="Armadura exposta"/>
@@ -2982,10 +2984,10 @@
                 <w:noProof/>
               </w:rPr>
               <w:drawing>
-                <wp:inline distT="0" distB="0" distL="0" distR="0" wp14:anchorId="16FBCBD6" wp14:editId="54C7856A">
+                <wp:inline distT="0" distB="0" distL="0" distR="0" wp14:anchorId="16565B7B" wp14:editId="0A004D7C">
                   <wp:extent cx="2667000" cy="1917700"/>
                   <wp:effectExtent l="0" t="0" r="0" b="6350"/>
-                  <wp:docPr id="1530320240" name="Imagem 1530320240"/>
+                  <wp:docPr id="1870323625" name="Imagem 1870323625"/>
                   <wp:cNvGraphicFramePr>
                     <a:graphicFrameLocks xmlns:a="http://schemas.openxmlformats.org/drawingml/2006/main"/>
                   </wp:cNvGraphicFramePr>
@@ -3047,7 +3049,7 @@
               <w:rPr>
                 <w:noProof/>
               </w:rPr>
-              <w:t>14</w:t>
+              <w:t>2</w:t>
             </w:r>
             <w:r>
               <w:rPr>
@@ -3066,9 +3068,9 @@
                 <w:rPr>
                   <w:noProof/>
                 </w:rPr>
-                <w:id w:val="1685164826"/>
+                <w:id w:val="1017120695"/>
                 <w:placeholder>
-                  <w:docPart w:val="C20C8B319277421EB530D9588D2715C0"/>
+                  <w:docPart w:val="2B3BF47EF2D44E97A0B3C672BD025E58"/>
                 </w:placeholder>
                 <w:comboBox>
                   <w:listItem w:displayText="Armadura exposta" w:value="Armadura exposta"/>
@@ -3175,10 +3177,10 @@
                 <w:noProof/>
               </w:rPr>
               <w:drawing>
-                <wp:inline distT="0" distB="0" distL="0" distR="0" wp14:anchorId="055627F3" wp14:editId="55475318">
+                <wp:inline distT="0" distB="0" distL="0" distR="0" wp14:anchorId="48A952AE" wp14:editId="22D5C5BD">
                   <wp:extent cx="2667000" cy="1917700"/>
                   <wp:effectExtent l="0" t="0" r="0" b="6350"/>
-                  <wp:docPr id="1826819690" name="Imagem 1826819690"/>
+                  <wp:docPr id="1500308606" name="Imagem 1500308606"/>
                   <wp:cNvGraphicFramePr>
                     <a:graphicFrameLocks xmlns:a="http://schemas.openxmlformats.org/drawingml/2006/main"/>
                   </wp:cNvGraphicFramePr>
@@ -3240,7 +3242,7 @@
               <w:rPr>
                 <w:noProof/>
               </w:rPr>
-              <w:t>15</w:t>
+              <w:t>3</w:t>
             </w:r>
             <w:r>
               <w:rPr>
@@ -3259,9 +3261,9 @@
                 <w:rPr>
                   <w:noProof/>
                 </w:rPr>
-                <w:id w:val="-1671254148"/>
+                <w:id w:val="1333569114"/>
                 <w:placeholder>
-                  <w:docPart w:val="BC507A04786F47668FFA501EA4117FE2"/>
+                  <w:docPart w:val="665B63C8A4C8412D812DF9BC59BEE7D1"/>
                 </w:placeholder>
                 <w:comboBox>
                   <w:listItem w:displayText="Armadura exposta" w:value="Armadura exposta"/>
@@ -3366,10 +3368,10 @@
                 <w:noProof/>
               </w:rPr>
               <w:drawing>
-                <wp:inline distT="0" distB="0" distL="0" distR="0" wp14:anchorId="2C4B93F1" wp14:editId="6A773E51">
+                <wp:inline distT="0" distB="0" distL="0" distR="0" wp14:anchorId="7E0FA60B" wp14:editId="3961F1A7">
                   <wp:extent cx="2667000" cy="1917700"/>
                   <wp:effectExtent l="0" t="0" r="0" b="6350"/>
-                  <wp:docPr id="593892147" name="Imagem 593892147"/>
+                  <wp:docPr id="1690780943" name="Imagem 1690780943"/>
                   <wp:cNvGraphicFramePr>
                     <a:graphicFrameLocks xmlns:a="http://schemas.openxmlformats.org/drawingml/2006/main"/>
                   </wp:cNvGraphicFramePr>
@@ -3431,7 +3433,7 @@
               <w:rPr>
                 <w:noProof/>
               </w:rPr>
-              <w:t>16</w:t>
+              <w:t>4</w:t>
             </w:r>
             <w:r>
               <w:rPr>
@@ -3450,1546 +3452,9 @@
                 <w:rPr>
                   <w:noProof/>
                 </w:rPr>
-                <w:id w:val="-2134400396"/>
+                <w:id w:val="820086975"/>
                 <w:placeholder>
-                  <w:docPart w:val="0BB0F6587CA043049F19E0352BD70015"/>
-                </w:placeholder>
-                <w:comboBox>
-                  <w:listItem w:displayText="Armadura exposta" w:value="Armadura exposta"/>
-                  <w:listItem w:displayText="Caixas de inspeção em desacordo à NBR 9050" w:value="Caixas de inspeção em desacordo à NBR 9050"/>
-                  <w:listItem w:displayText="Cobertura de acesso ao bloco" w:value="Cobertura de acesso ao bloco"/>
-                  <w:listItem w:displayText="Concreção ferruginosa" w:value="Concreção ferruginosa"/>
-                  <w:listItem w:displayText="Condutor em desacordo à NBR10844" w:value="Condutor em desacordo à NBR10844"/>
-                  <w:listItem w:displayText="Contenção-Talude" w:value="Contenção-Talude"/>
-                  <w:listItem w:displayText="Corrosão de elementos metálicos" w:value="Corrosão de elementos metálicos"/>
-                  <w:listItem w:displayText="Degraus em desacordo à NBR 9050" w:value="Degraus em desacordo à NBR 9050"/>
-                  <w:listItem w:displayText="Destelhamento" w:value="Destelhamento"/>
-                  <w:listItem w:displayText="Deterioração da pavimentação" w:value="Deterioração da pavimentação"/>
-                  <w:listItem w:displayText="Deterioração do calçamento" w:value="Deterioração do calçamento"/>
-                  <w:listItem w:displayText="Drenagem superficial ineficiente" w:value="Drenagem superficial ineficiente"/>
-                  <w:listItem w:displayText="Empolamento do revestimento" w:value="Empolamento do revestimento"/>
-                  <w:listItem w:displayText="Erosão do solo" w:value="Erosão do solo"/>
-                  <w:listItem w:displayText="Faixa de umidade persistente" w:value="Faixa de umidade persistente"/>
-                  <w:listItem w:displayText="Falha de aderência da pintura" w:value="Falha de aderência da pintura"/>
-                  <w:listItem w:displayText="Falha na vedação / soldagem das conecções" w:value="Falha na vedação / soldagem das conecções"/>
-                  <w:listItem w:displayText="Falha na vinculação de elementos" w:value="Falha na vinculação de elementos"/>
-                  <w:listItem w:displayText="Falta de calha de captação pluvial" w:value="Falta de calha de captação pluvial"/>
-                  <w:listItem w:displayText="Falta de dispositivo DR" w:value="Falta de dispositivo DR"/>
-                  <w:listItem w:displayText="Falta de piso tátil" w:value="Falta de piso tátil"/>
-                  <w:listItem w:displayText="Falta de rufo pingadeira" w:value="Falta de rufo pingadeira"/>
-                  <w:listItem w:displayText="Falta de sinalização visual" w:value="Falta de sinalização visual"/>
-                  <w:listItem w:displayText="Falta ou falha da faixa de travessia" w:value="Falta ou falha da faixa de travessia"/>
-                  <w:listItem w:displayText="Falta ou falha da pingadeira" w:value="Falta ou falha da pingadeira"/>
-                  <w:listItem w:displayText="Falta ou falha da rampa de acesso" w:value="Falta ou falha da rampa de acesso"/>
-                  <w:listItem w:displayText="Falta ou falha da vaga acessível" w:value="Falta ou falha da vaga acessível"/>
-                  <w:listItem w:displayText="Falta ou falha de corrimão" w:value="Falta ou falha de corrimão"/>
-                  <w:listItem w:displayText="Falta ou falha de vaga acessível" w:value="Falta ou falha de vaga acessível"/>
-                  <w:listItem w:displayText="Falta ou falha do guarda-corpo" w:value="Falta ou falha do guarda-corpo"/>
-                  <w:listItem w:displayText="Falta ou falha do peitoril" w:value="Falta ou falha do peitoril"/>
-                  <w:listItem w:displayText="Fissura higroscópica" w:value="Fissura higroscópica"/>
-                  <w:listItem w:displayText="Fissura mapeada" w:value="Fissura mapeada"/>
-                  <w:listItem w:displayText="Infiltração pela fachada" w:value="Infiltração pela fachada"/>
-                  <w:listItem w:displayText="Infiltração pelas esquadrias" w:value="Infiltração pelas esquadrias"/>
-                  <w:listItem w:displayText="Infiltração pelo cobogó" w:value="Infiltração pelo cobogó"/>
-                  <w:listItem w:displayText="Má instalação das janelas" w:value="Má instalação das janelas"/>
-                  <w:listItem w:displayText="Muro de arrimo-Falta de drenagem" w:value="Muro de arrimo-Falta de drenagem"/>
-                  <w:listItem w:displayText="Muro de arrimo-Trincas e deformações" w:value="Muro de arrimo-Trincas e deformações"/>
-                  <w:listItem w:displayText="Muro de divisa-Trincas, deformação, umidade, reboco" w:value="Muro de divisa-Trincas, deformação, umidade, reboco"/>
-                  <w:listItem w:displayText="Piso solto, trincado ou com som cavo" w:value="Piso solto, trincado ou com som cavo"/>
-                  <w:listItem w:displayText="Prolongamnto insuficiente do peitoril" w:value="Prolongamnto insuficiente do peitoril"/>
-                  <w:listItem w:displayText="Reboco em desacordo à NBR 13529" w:value="Reboco em desacordo à NBR 13529"/>
-                  <w:listItem w:displayText="Reboco em desacordo às NBRs 7298 / 13749" w:value="Reboco em desacordo às NBRs 7298 / 13749"/>
-                  <w:listItem w:displayText="Reparo inadequado" w:value="Reparo inadequado"/>
-                  <w:listItem w:displayText="Revestimento argamassado pulverulento" w:value="Revestimento argamassado pulverulento"/>
-                  <w:listItem w:displayText="Revestimento argamassado solto" w:value="Revestimento argamassado solto"/>
-                  <w:listItem w:displayText="Rufo nas platibandas" w:value="Rufo nas platibandas"/>
-                  <w:listItem w:displayText="Tampas em desacordo à NBR 8160" w:value="Tampas em desacordo à NBR 8160"/>
-                  <w:listItem w:displayText="Transpasse inadequado do peitoril" w:value="Transpasse inadequado do peitoril"/>
-                  <w:listItem w:displayText="Trinca contigua à esquadria" w:value="Trinca contigua à esquadria"/>
-                  <w:listItem w:displayText="Trinca devido à deformação estrutural" w:value="Trinca devido à deformação estrutural"/>
-                  <w:listItem w:displayText="Trinca entre a laje e alvenaria" w:value="Trinca entre a laje e alvenaria"/>
-                  <w:listItem w:displayText="Trinca horizontal" w:value="Trinca horizontal"/>
-                  <w:listItem w:displayText="Trinca na laje (hall)" w:value="Trinca na laje (hall)"/>
-                  <w:listItem w:displayText="Trinca no abrigo" w:value="Trinca no abrigo"/>
-                  <w:listItem w:displayText="Trinca no calçamento" w:value="Trinca no calçamento"/>
-                  <w:listItem w:displayText="Trinca no calçamento perimentral" w:value="Trinca no calçamento perimentral"/>
-                  <w:listItem w:displayText="Trinca saindo da janela" w:value="Trinca saindo da janela"/>
-                  <w:listItem w:displayText="Trinca saindo da porta" w:value="Trinca saindo da porta"/>
-                  <w:listItem w:displayText="Trinca vertical na alvenaria" w:value="Trinca vertical na alvenaria"/>
-                  <w:listItem w:displayText="Umidade ascendente" w:value="Umidade ascendente"/>
-                  <w:listItem w:displayText="Umidade na moldura" w:value="Umidade na moldura"/>
-                  <w:listItem w:displayText="Umidade no alçapão" w:value="Umidade no alçapão"/>
-                  <w:listItem w:displayText="Utilização de elemento não estanque (cobogo)" w:value="Utilização de elemento não estanque (cobogo)"/>
-                  <w:listItem w:displayText="Umidade na fachada" w:value="Umidade na fachada"/>
-                  <w:listItem w:displayText="Falha da impermeabilização das áreas molháveis" w:value="Falha da impermeabilização das áreas molháveis"/>
-                  <w:listItem w:displayText="Fissura na junta de dilatação" w:value="Fissura na junta de dilatação"/>
-                  <w:listItem w:displayText="Umidade nos frisos" w:value="Umidade nos frisos"/>
-                </w:comboBox>
-              </w:sdtPr>
-              <w:sdtContent>
-                <w:r>
-                  <w:rPr>
-                    <w:noProof/>
-                  </w:rPr>
-                  <w:t>Identificação</w:t>
-                </w:r>
-              </w:sdtContent>
-            </w:sdt>
-          </w:p>
-        </w:tc>
-      </w:tr>
-      <w:tr>
-        <w:tc>
-          <w:tcPr>
-            <w:tcW w:w="4589" w:type="dxa"/>
-            <w:tcBorders>
-              <w:top w:val="nil"/>
-              <w:left w:val="nil"/>
-              <w:bottom w:val="nil"/>
-              <w:right w:val="nil"/>
-            </w:tcBorders>
-          </w:tcPr>
-          <w:p>
-            <w:pPr>
-              <w:ind w:firstLine="0"/>
-              <w:jc w:val="center"/>
-            </w:pPr>
-            <w:r>
-              <w:rPr>
-                <w:noProof/>
-              </w:rPr>
-              <w:drawing>
-                <wp:inline distT="0" distB="0" distL="0" distR="0" wp14:anchorId="7B9EAB59" wp14:editId="11207430">
-                  <wp:extent cx="2667000" cy="1917700"/>
-                  <wp:effectExtent l="0" t="0" r="0" b="6350"/>
-                  <wp:docPr id="1053080131" name="Imagem 1053080131"/>
-                  <wp:cNvGraphicFramePr>
-                    <a:graphicFrameLocks xmlns:a="http://schemas.openxmlformats.org/drawingml/2006/main"/>
-                  </wp:cNvGraphicFramePr>
-                  <a:graphic xmlns:a="http://schemas.openxmlformats.org/drawingml/2006/main">
-                    <a:graphicData uri="http://schemas.openxmlformats.org/drawingml/2006/picture">
-                      <pic:pic xmlns:pic="http://schemas.openxmlformats.org/drawingml/2006/picture">
-                        <pic:nvPicPr>
-                          <pic:cNvPr id="1" name=""/>
-                          <pic:cNvPicPr/>
-                        </pic:nvPicPr>
-                        <pic:blipFill>
-                          <a:blip r:embed="rId12"/>
-                          <a:stretch>
-                            <a:fillRect/>
-                          </a:stretch>
-                        </pic:blipFill>
-                        <pic:spPr>
-                          <a:xfrm>
-                            <a:off x="0" y="0"/>
-                            <a:ext cx="2667000" cy="1917700"/>
-                          </a:xfrm>
-                          <a:prstGeom prst="rect">
-                            <a:avLst/>
-                          </a:prstGeom>
-                        </pic:spPr>
-                      </pic:pic>
-                    </a:graphicData>
-                  </a:graphic>
-                </wp:inline>
-              </w:drawing>
-            </w:r>
-          </w:p>
-          <w:p>
-            <w:pPr>
-              <w:pStyle w:val="Legenda"/>
-            </w:pPr>
-            <w:r>
-              <w:t xml:space="preserve">Foto </w:t>
-            </w:r>
-            <w:r>
-              <w:rPr>
-                <w:noProof/>
-              </w:rPr>
-              <w:fldChar w:fldCharType="begin"/>
-            </w:r>
-            <w:r>
-              <w:rPr>
-                <w:noProof/>
-              </w:rPr>
-              <w:instrText xml:space="preserve"> SEQ Foto \* ARABIC </w:instrText>
-            </w:r>
-            <w:r>
-              <w:rPr>
-                <w:noProof/>
-              </w:rPr>
-              <w:fldChar w:fldCharType="separate"/>
-            </w:r>
-            <w:r>
-              <w:rPr>
-                <w:noProof/>
-              </w:rPr>
-              <w:t>17</w:t>
-            </w:r>
-            <w:r>
-              <w:rPr>
-                <w:noProof/>
-              </w:rPr>
-              <w:fldChar w:fldCharType="end"/>
-            </w:r>
-            <w:r>
-              <w:rPr>
-                <w:noProof/>
-              </w:rPr>
-              <w:t xml:space="preserve"> – </w:t>
-            </w:r>
-            <w:sdt>
-              <w:sdtPr>
-                <w:rPr>
-                  <w:noProof/>
-                </w:rPr>
-                <w:id w:val="-1506433489"/>
-                <w:placeholder>
-                  <w:docPart w:val="1BAAE7C0774C44EABB0D3E48A4BF71C4"/>
-                </w:placeholder>
-                <w:comboBox>
-                  <w:listItem w:displayText="Armadura exposta" w:value="Armadura exposta"/>
-                  <w:listItem w:displayText="Caixas de inspeção em desacordo à NBR 9050" w:value="Caixas de inspeção em desacordo à NBR 9050"/>
-                  <w:listItem w:displayText="Cobertura de acesso ao bloco" w:value="Cobertura de acesso ao bloco"/>
-                  <w:listItem w:displayText="Concreção ferruginosa" w:value="Concreção ferruginosa"/>
-                  <w:listItem w:displayText="Condutor em desacordo à NBR10844" w:value="Condutor em desacordo à NBR10844"/>
-                  <w:listItem w:displayText="Contenção-Talude" w:value="Contenção-Talude"/>
-                  <w:listItem w:displayText="Corrosão de elementos metálicos" w:value="Corrosão de elementos metálicos"/>
-                  <w:listItem w:displayText="Degraus em desacordo à NBR 9050" w:value="Degraus em desacordo à NBR 9050"/>
-                  <w:listItem w:displayText="Destelhamento" w:value="Destelhamento"/>
-                  <w:listItem w:displayText="Deterioração da pavimentação" w:value="Deterioração da pavimentação"/>
-                  <w:listItem w:displayText="Deterioração do calçamento" w:value="Deterioração do calçamento"/>
-                  <w:listItem w:displayText="Drenagem superficial ineficiente" w:value="Drenagem superficial ineficiente"/>
-                  <w:listItem w:displayText="Empolamento do revestimento" w:value="Empolamento do revestimento"/>
-                  <w:listItem w:displayText="Erosão do solo" w:value="Erosão do solo"/>
-                  <w:listItem w:displayText="Faixa de umidade persistente" w:value="Faixa de umidade persistente"/>
-                  <w:listItem w:displayText="Falha de aderência da pintura" w:value="Falha de aderência da pintura"/>
-                  <w:listItem w:displayText="Falha na vedação / soldagem das conecções" w:value="Falha na vedação / soldagem das conecções"/>
-                  <w:listItem w:displayText="Falha na vinculação de elementos" w:value="Falha na vinculação de elementos"/>
-                  <w:listItem w:displayText="Falta de calha de captação pluvial" w:value="Falta de calha de captação pluvial"/>
-                  <w:listItem w:displayText="Falta de dispositivo DR" w:value="Falta de dispositivo DR"/>
-                  <w:listItem w:displayText="Falta de piso tátil" w:value="Falta de piso tátil"/>
-                  <w:listItem w:displayText="Falta de rufo pingadeira" w:value="Falta de rufo pingadeira"/>
-                  <w:listItem w:displayText="Falta de sinalização visual" w:value="Falta de sinalização visual"/>
-                  <w:listItem w:displayText="Falta ou falha da faixa de travessia" w:value="Falta ou falha da faixa de travessia"/>
-                  <w:listItem w:displayText="Falta ou falha da pingadeira" w:value="Falta ou falha da pingadeira"/>
-                  <w:listItem w:displayText="Falta ou falha da rampa de acesso" w:value="Falta ou falha da rampa de acesso"/>
-                  <w:listItem w:displayText="Falta ou falha da vaga acessível" w:value="Falta ou falha da vaga acessível"/>
-                  <w:listItem w:displayText="Falta ou falha de corrimão" w:value="Falta ou falha de corrimão"/>
-                  <w:listItem w:displayText="Falta ou falha de vaga acessível" w:value="Falta ou falha de vaga acessível"/>
-                  <w:listItem w:displayText="Falta ou falha do guarda-corpo" w:value="Falta ou falha do guarda-corpo"/>
-                  <w:listItem w:displayText="Falta ou falha do peitoril" w:value="Falta ou falha do peitoril"/>
-                  <w:listItem w:displayText="Fissura higroscópica" w:value="Fissura higroscópica"/>
-                  <w:listItem w:displayText="Fissura mapeada" w:value="Fissura mapeada"/>
-                  <w:listItem w:displayText="Infiltração pela fachada" w:value="Infiltração pela fachada"/>
-                  <w:listItem w:displayText="Infiltração pelas esquadrias" w:value="Infiltração pelas esquadrias"/>
-                  <w:listItem w:displayText="Infiltração pelo cobogó" w:value="Infiltração pelo cobogó"/>
-                  <w:listItem w:displayText="Má instalação das janelas" w:value="Má instalação das janelas"/>
-                  <w:listItem w:displayText="Muro de arrimo-Falta de drenagem" w:value="Muro de arrimo-Falta de drenagem"/>
-                  <w:listItem w:displayText="Muro de arrimo-Trincas e deformações" w:value="Muro de arrimo-Trincas e deformações"/>
-                  <w:listItem w:displayText="Muro de divisa-Trincas, deformação, umidade, reboco" w:value="Muro de divisa-Trincas, deformação, umidade, reboco"/>
-                  <w:listItem w:displayText="Piso solto, trincado ou com som cavo" w:value="Piso solto, trincado ou com som cavo"/>
-                  <w:listItem w:displayText="Prolongamnto insuficiente do peitoril" w:value="Prolongamnto insuficiente do peitoril"/>
-                  <w:listItem w:displayText="Reboco em desacordo à NBR 13529" w:value="Reboco em desacordo à NBR 13529"/>
-                  <w:listItem w:displayText="Reboco em desacordo às NBRs 7298 / 13749" w:value="Reboco em desacordo às NBRs 7298 / 13749"/>
-                  <w:listItem w:displayText="Reparo inadequado" w:value="Reparo inadequado"/>
-                  <w:listItem w:displayText="Revestimento argamassado pulverulento" w:value="Revestimento argamassado pulverulento"/>
-                  <w:listItem w:displayText="Revestimento argamassado solto" w:value="Revestimento argamassado solto"/>
-                  <w:listItem w:displayText="Rufo nas platibandas" w:value="Rufo nas platibandas"/>
-                  <w:listItem w:displayText="Tampas em desacordo à NBR 8160" w:value="Tampas em desacordo à NBR 8160"/>
-                  <w:listItem w:displayText="Transpasse inadequado do peitoril" w:value="Transpasse inadequado do peitoril"/>
-                  <w:listItem w:displayText="Trinca contigua à esquadria" w:value="Trinca contigua à esquadria"/>
-                  <w:listItem w:displayText="Trinca devido à deformação estrutural" w:value="Trinca devido à deformação estrutural"/>
-                  <w:listItem w:displayText="Trinca entre a laje e alvenaria" w:value="Trinca entre a laje e alvenaria"/>
-                  <w:listItem w:displayText="Trinca horizontal" w:value="Trinca horizontal"/>
-                  <w:listItem w:displayText="Trinca na laje (hall)" w:value="Trinca na laje (hall)"/>
-                  <w:listItem w:displayText="Trinca no abrigo" w:value="Trinca no abrigo"/>
-                  <w:listItem w:displayText="Trinca no calçamento" w:value="Trinca no calçamento"/>
-                  <w:listItem w:displayText="Trinca no calçamento perimentral" w:value="Trinca no calçamento perimentral"/>
-                  <w:listItem w:displayText="Trinca saindo da janela" w:value="Trinca saindo da janela"/>
-                  <w:listItem w:displayText="Trinca saindo da porta" w:value="Trinca saindo da porta"/>
-                  <w:listItem w:displayText="Trinca vertical na alvenaria" w:value="Trinca vertical na alvenaria"/>
-                  <w:listItem w:displayText="Umidade ascendente" w:value="Umidade ascendente"/>
-                  <w:listItem w:displayText="Umidade na moldura" w:value="Umidade na moldura"/>
-                  <w:listItem w:displayText="Umidade no alçapão" w:value="Umidade no alçapão"/>
-                  <w:listItem w:displayText="Utilização de elemento não estanque (cobogo)" w:value="Utilização de elemento não estanque (cobogo)"/>
-                  <w:listItem w:displayText="Umidade na fachada" w:value="Umidade na fachada"/>
-                  <w:listItem w:displayText="Falha da impermeabilização das áreas molháveis" w:value="Falha da impermeabilização das áreas molháveis"/>
-                  <w:listItem w:displayText="Fissura na junta de dilatação" w:value="Fissura na junta de dilatação"/>
-                  <w:listItem w:displayText="Umidade nos frisos" w:value="Umidade nos frisos"/>
-                </w:comboBox>
-              </w:sdtPr>
-              <w:sdtContent>
-                <w:r>
-                  <w:rPr>
-                    <w:noProof/>
-                  </w:rPr>
-                  <w:t>Identificação</w:t>
-                </w:r>
-              </w:sdtContent>
-            </w:sdt>
-          </w:p>
-        </w:tc>
-        <w:tc>
-          <w:tcPr>
-            <w:tcW w:w="4589" w:type="dxa"/>
-            <w:tcBorders>
-              <w:top w:val="nil"/>
-              <w:left w:val="nil"/>
-              <w:bottom w:val="nil"/>
-              <w:right w:val="nil"/>
-            </w:tcBorders>
-          </w:tcPr>
-          <w:p>
-            <w:pPr>
-              <w:ind w:firstLine="0"/>
-              <w:jc w:val="center"/>
-            </w:pPr>
-            <w:r>
-              <w:rPr>
-                <w:noProof/>
-              </w:rPr>
-              <w:drawing>
-                <wp:inline distT="0" distB="0" distL="0" distR="0" wp14:anchorId="25161CD9" wp14:editId="5C5D6847">
-                  <wp:extent cx="2667000" cy="1917700"/>
-                  <wp:effectExtent l="0" t="0" r="0" b="6350"/>
-                  <wp:docPr id="689027582" name="Imagem 689027582"/>
-                  <wp:cNvGraphicFramePr>
-                    <a:graphicFrameLocks xmlns:a="http://schemas.openxmlformats.org/drawingml/2006/main"/>
-                  </wp:cNvGraphicFramePr>
-                  <a:graphic xmlns:a="http://schemas.openxmlformats.org/drawingml/2006/main">
-                    <a:graphicData uri="http://schemas.openxmlformats.org/drawingml/2006/picture">
-                      <pic:pic xmlns:pic="http://schemas.openxmlformats.org/drawingml/2006/picture">
-                        <pic:nvPicPr>
-                          <pic:cNvPr id="1" name=""/>
-                          <pic:cNvPicPr/>
-                        </pic:nvPicPr>
-                        <pic:blipFill>
-                          <a:blip r:embed="rId13"/>
-                          <a:stretch>
-                            <a:fillRect/>
-                          </a:stretch>
-                        </pic:blipFill>
-                        <pic:spPr>
-                          <a:xfrm>
-                            <a:off x="0" y="0"/>
-                            <a:ext cx="2667000" cy="1917700"/>
-                          </a:xfrm>
-                          <a:prstGeom prst="rect">
-                            <a:avLst/>
-                          </a:prstGeom>
-                        </pic:spPr>
-                      </pic:pic>
-                    </a:graphicData>
-                  </a:graphic>
-                </wp:inline>
-              </w:drawing>
-            </w:r>
-          </w:p>
-          <w:p>
-            <w:pPr>
-              <w:pStyle w:val="Legenda"/>
-            </w:pPr>
-            <w:r>
-              <w:t xml:space="preserve">Foto </w:t>
-            </w:r>
-            <w:r>
-              <w:rPr>
-                <w:noProof/>
-              </w:rPr>
-              <w:fldChar w:fldCharType="begin"/>
-            </w:r>
-            <w:r>
-              <w:rPr>
-                <w:noProof/>
-              </w:rPr>
-              <w:instrText xml:space="preserve"> SEQ Foto \* ARABIC </w:instrText>
-            </w:r>
-            <w:r>
-              <w:rPr>
-                <w:noProof/>
-              </w:rPr>
-              <w:fldChar w:fldCharType="separate"/>
-            </w:r>
-            <w:r>
-              <w:rPr>
-                <w:noProof/>
-              </w:rPr>
-              <w:t>18</w:t>
-            </w:r>
-            <w:r>
-              <w:rPr>
-                <w:noProof/>
-              </w:rPr>
-              <w:fldChar w:fldCharType="end"/>
-            </w:r>
-            <w:r>
-              <w:rPr>
-                <w:noProof/>
-              </w:rPr>
-              <w:t xml:space="preserve"> – </w:t>
-            </w:r>
-            <w:sdt>
-              <w:sdtPr>
-                <w:rPr>
-                  <w:noProof/>
-                </w:rPr>
-                <w:id w:val="-1337379558"/>
-                <w:placeholder>
-                  <w:docPart w:val="65CDE118BA6643DEBDD8A17E1B137ADA"/>
-                </w:placeholder>
-                <w:comboBox>
-                  <w:listItem w:displayText="Armadura exposta" w:value="Armadura exposta"/>
-                  <w:listItem w:displayText="Caixas de inspeção em desacordo à NBR 9050" w:value="Caixas de inspeção em desacordo à NBR 9050"/>
-                  <w:listItem w:displayText="Cobertura de acesso ao bloco" w:value="Cobertura de acesso ao bloco"/>
-                  <w:listItem w:displayText="Concreção ferruginosa" w:value="Concreção ferruginosa"/>
-                  <w:listItem w:displayText="Condutor em desacordo à NBR10844" w:value="Condutor em desacordo à NBR10844"/>
-                  <w:listItem w:displayText="Contenção-Talude" w:value="Contenção-Talude"/>
-                  <w:listItem w:displayText="Corrosão de elementos metálicos" w:value="Corrosão de elementos metálicos"/>
-                  <w:listItem w:displayText="Degraus em desacordo à NBR 9050" w:value="Degraus em desacordo à NBR 9050"/>
-                  <w:listItem w:displayText="Destelhamento" w:value="Destelhamento"/>
-                  <w:listItem w:displayText="Deterioração da pavimentação" w:value="Deterioração da pavimentação"/>
-                  <w:listItem w:displayText="Deterioração do calçamento" w:value="Deterioração do calçamento"/>
-                  <w:listItem w:displayText="Drenagem superficial ineficiente" w:value="Drenagem superficial ineficiente"/>
-                  <w:listItem w:displayText="Empolamento do revestimento" w:value="Empolamento do revestimento"/>
-                  <w:listItem w:displayText="Erosão do solo" w:value="Erosão do solo"/>
-                  <w:listItem w:displayText="Faixa de umidade persistente" w:value="Faixa de umidade persistente"/>
-                  <w:listItem w:displayText="Falha de aderência da pintura" w:value="Falha de aderência da pintura"/>
-                  <w:listItem w:displayText="Falha na vedação / soldagem das conecções" w:value="Falha na vedação / soldagem das conecções"/>
-                  <w:listItem w:displayText="Falha na vinculação de elementos" w:value="Falha na vinculação de elementos"/>
-                  <w:listItem w:displayText="Falta de calha de captação pluvial" w:value="Falta de calha de captação pluvial"/>
-                  <w:listItem w:displayText="Falta de dispositivo DR" w:value="Falta de dispositivo DR"/>
-                  <w:listItem w:displayText="Falta de piso tátil" w:value="Falta de piso tátil"/>
-                  <w:listItem w:displayText="Falta de rufo pingadeira" w:value="Falta de rufo pingadeira"/>
-                  <w:listItem w:displayText="Falta de sinalização visual" w:value="Falta de sinalização visual"/>
-                  <w:listItem w:displayText="Falta ou falha da faixa de travessia" w:value="Falta ou falha da faixa de travessia"/>
-                  <w:listItem w:displayText="Falta ou falha da pingadeira" w:value="Falta ou falha da pingadeira"/>
-                  <w:listItem w:displayText="Falta ou falha da rampa de acesso" w:value="Falta ou falha da rampa de acesso"/>
-                  <w:listItem w:displayText="Falta ou falha da vaga acessível" w:value="Falta ou falha da vaga acessível"/>
-                  <w:listItem w:displayText="Falta ou falha de corrimão" w:value="Falta ou falha de corrimão"/>
-                  <w:listItem w:displayText="Falta ou falha de vaga acessível" w:value="Falta ou falha de vaga acessível"/>
-                  <w:listItem w:displayText="Falta ou falha do guarda-corpo" w:value="Falta ou falha do guarda-corpo"/>
-                  <w:listItem w:displayText="Falta ou falha do peitoril" w:value="Falta ou falha do peitoril"/>
-                  <w:listItem w:displayText="Fissura higroscópica" w:value="Fissura higroscópica"/>
-                  <w:listItem w:displayText="Fissura mapeada" w:value="Fissura mapeada"/>
-                  <w:listItem w:displayText="Infiltração pela fachada" w:value="Infiltração pela fachada"/>
-                  <w:listItem w:displayText="Infiltração pelas esquadrias" w:value="Infiltração pelas esquadrias"/>
-                  <w:listItem w:displayText="Infiltração pelo cobogó" w:value="Infiltração pelo cobogó"/>
-                  <w:listItem w:displayText="Má instalação das janelas" w:value="Má instalação das janelas"/>
-                  <w:listItem w:displayText="Muro de arrimo-Falta de drenagem" w:value="Muro de arrimo-Falta de drenagem"/>
-                  <w:listItem w:displayText="Muro de arrimo-Trincas e deformações" w:value="Muro de arrimo-Trincas e deformações"/>
-                  <w:listItem w:displayText="Muro de divisa-Trincas, deformação, umidade, reboco" w:value="Muro de divisa-Trincas, deformação, umidade, reboco"/>
-                  <w:listItem w:displayText="Piso solto, trincado ou com som cavo" w:value="Piso solto, trincado ou com som cavo"/>
-                  <w:listItem w:displayText="Prolongamnto insuficiente do peitoril" w:value="Prolongamnto insuficiente do peitoril"/>
-                  <w:listItem w:displayText="Reboco em desacordo à NBR 13529" w:value="Reboco em desacordo à NBR 13529"/>
-                  <w:listItem w:displayText="Reboco em desacordo às NBRs 7298 / 13749" w:value="Reboco em desacordo às NBRs 7298 / 13749"/>
-                  <w:listItem w:displayText="Reparo inadequado" w:value="Reparo inadequado"/>
-                  <w:listItem w:displayText="Revestimento argamassado pulverulento" w:value="Revestimento argamassado pulverulento"/>
-                  <w:listItem w:displayText="Revestimento argamassado solto" w:value="Revestimento argamassado solto"/>
-                  <w:listItem w:displayText="Rufo nas platibandas" w:value="Rufo nas platibandas"/>
-                  <w:listItem w:displayText="Tampas em desacordo à NBR 8160" w:value="Tampas em desacordo à NBR 8160"/>
-                  <w:listItem w:displayText="Transpasse inadequado do peitoril" w:value="Transpasse inadequado do peitoril"/>
-                  <w:listItem w:displayText="Trinca contigua à esquadria" w:value="Trinca contigua à esquadria"/>
-                  <w:listItem w:displayText="Trinca devido à deformação estrutural" w:value="Trinca devido à deformação estrutural"/>
-                  <w:listItem w:displayText="Trinca entre a laje e alvenaria" w:value="Trinca entre a laje e alvenaria"/>
-                  <w:listItem w:displayText="Trinca horizontal" w:value="Trinca horizontal"/>
-                  <w:listItem w:displayText="Trinca na laje (hall)" w:value="Trinca na laje (hall)"/>
-                  <w:listItem w:displayText="Trinca no abrigo" w:value="Trinca no abrigo"/>
-                  <w:listItem w:displayText="Trinca no calçamento" w:value="Trinca no calçamento"/>
-                  <w:listItem w:displayText="Trinca no calçamento perimentral" w:value="Trinca no calçamento perimentral"/>
-                  <w:listItem w:displayText="Trinca saindo da janela" w:value="Trinca saindo da janela"/>
-                  <w:listItem w:displayText="Trinca saindo da porta" w:value="Trinca saindo da porta"/>
-                  <w:listItem w:displayText="Trinca vertical na alvenaria" w:value="Trinca vertical na alvenaria"/>
-                  <w:listItem w:displayText="Umidade ascendente" w:value="Umidade ascendente"/>
-                  <w:listItem w:displayText="Umidade na moldura" w:value="Umidade na moldura"/>
-                  <w:listItem w:displayText="Umidade no alçapão" w:value="Umidade no alçapão"/>
-                  <w:listItem w:displayText="Utilização de elemento não estanque (cobogo)" w:value="Utilização de elemento não estanque (cobogo)"/>
-                  <w:listItem w:displayText="Umidade na fachada" w:value="Umidade na fachada"/>
-                  <w:listItem w:displayText="Falha da impermeabilização das áreas molháveis" w:value="Falha da impermeabilização das áreas molháveis"/>
-                  <w:listItem w:displayText="Fissura na junta de dilatação" w:value="Fissura na junta de dilatação"/>
-                  <w:listItem w:displayText="Umidade nos frisos" w:value="Umidade nos frisos"/>
-                </w:comboBox>
-              </w:sdtPr>
-              <w:sdtContent>
-                <w:r>
-                  <w:rPr>
-                    <w:noProof/>
-                  </w:rPr>
-                  <w:t>Identificação</w:t>
-                </w:r>
-              </w:sdtContent>
-            </w:sdt>
-          </w:p>
-        </w:tc>
-      </w:tr>
-      <w:tr>
-        <w:tc>
-          <w:tcPr>
-            <w:tcW w:w="4589" w:type="dxa"/>
-            <w:tcBorders>
-              <w:top w:val="nil"/>
-              <w:left w:val="nil"/>
-              <w:bottom w:val="nil"/>
-              <w:right w:val="nil"/>
-            </w:tcBorders>
-          </w:tcPr>
-          <w:p>
-            <w:pPr>
-              <w:ind w:firstLine="0"/>
-              <w:jc w:val="center"/>
-            </w:pPr>
-            <w:r>
-              <w:rPr>
-                <w:noProof/>
-              </w:rPr>
-              <w:drawing>
-                <wp:inline distT="0" distB="0" distL="0" distR="0" wp14:anchorId="06765585" wp14:editId="04BB8E1C">
-                  <wp:extent cx="2667000" cy="1917700"/>
-                  <wp:effectExtent l="0" t="0" r="0" b="6350"/>
-                  <wp:docPr id="491293019" name="Imagem 491293019"/>
-                  <wp:cNvGraphicFramePr>
-                    <a:graphicFrameLocks xmlns:a="http://schemas.openxmlformats.org/drawingml/2006/main"/>
-                  </wp:cNvGraphicFramePr>
-                  <a:graphic xmlns:a="http://schemas.openxmlformats.org/drawingml/2006/main">
-                    <a:graphicData uri="http://schemas.openxmlformats.org/drawingml/2006/picture">
-                      <pic:pic xmlns:pic="http://schemas.openxmlformats.org/drawingml/2006/picture">
-                        <pic:nvPicPr>
-                          <pic:cNvPr id="1" name=""/>
-                          <pic:cNvPicPr/>
-                        </pic:nvPicPr>
-                        <pic:blipFill>
-                          <a:blip r:embed="rId12"/>
-                          <a:stretch>
-                            <a:fillRect/>
-                          </a:stretch>
-                        </pic:blipFill>
-                        <pic:spPr>
-                          <a:xfrm>
-                            <a:off x="0" y="0"/>
-                            <a:ext cx="2667000" cy="1917700"/>
-                          </a:xfrm>
-                          <a:prstGeom prst="rect">
-                            <a:avLst/>
-                          </a:prstGeom>
-                        </pic:spPr>
-                      </pic:pic>
-                    </a:graphicData>
-                  </a:graphic>
-                </wp:inline>
-              </w:drawing>
-            </w:r>
-          </w:p>
-          <w:p>
-            <w:pPr>
-              <w:pStyle w:val="Legenda"/>
-            </w:pPr>
-            <w:r>
-              <w:t xml:space="preserve">Foto </w:t>
-            </w:r>
-            <w:r>
-              <w:rPr>
-                <w:noProof/>
-              </w:rPr>
-              <w:fldChar w:fldCharType="begin"/>
-            </w:r>
-            <w:r>
-              <w:rPr>
-                <w:noProof/>
-              </w:rPr>
-              <w:instrText xml:space="preserve"> SEQ Foto \* ARABIC </w:instrText>
-            </w:r>
-            <w:r>
-              <w:rPr>
-                <w:noProof/>
-              </w:rPr>
-              <w:fldChar w:fldCharType="separate"/>
-            </w:r>
-            <w:r>
-              <w:rPr>
-                <w:noProof/>
-              </w:rPr>
-              <w:t>19</w:t>
-            </w:r>
-            <w:r>
-              <w:rPr>
-                <w:noProof/>
-              </w:rPr>
-              <w:fldChar w:fldCharType="end"/>
-            </w:r>
-            <w:r>
-              <w:rPr>
-                <w:noProof/>
-              </w:rPr>
-              <w:t xml:space="preserve"> – </w:t>
-            </w:r>
-            <w:sdt>
-              <w:sdtPr>
-                <w:rPr>
-                  <w:noProof/>
-                </w:rPr>
-                <w:id w:val="1918280238"/>
-                <w:placeholder>
-                  <w:docPart w:val="DB6571CB87B142BE9E8173EF8B56B5AA"/>
-                </w:placeholder>
-                <w:comboBox>
-                  <w:listItem w:displayText="Armadura exposta" w:value="Armadura exposta"/>
-                  <w:listItem w:displayText="Caixas de inspeção em desacordo à NBR 9050" w:value="Caixas de inspeção em desacordo à NBR 9050"/>
-                  <w:listItem w:displayText="Cobertura de acesso ao bloco" w:value="Cobertura de acesso ao bloco"/>
-                  <w:listItem w:displayText="Concreção ferruginosa" w:value="Concreção ferruginosa"/>
-                  <w:listItem w:displayText="Condutor em desacordo à NBR10844" w:value="Condutor em desacordo à NBR10844"/>
-                  <w:listItem w:displayText="Contenção-Talude" w:value="Contenção-Talude"/>
-                  <w:listItem w:displayText="Corrosão de elementos metálicos" w:value="Corrosão de elementos metálicos"/>
-                  <w:listItem w:displayText="Degraus em desacordo à NBR 9050" w:value="Degraus em desacordo à NBR 9050"/>
-                  <w:listItem w:displayText="Destelhamento" w:value="Destelhamento"/>
-                  <w:listItem w:displayText="Deterioração da pavimentação" w:value="Deterioração da pavimentação"/>
-                  <w:listItem w:displayText="Deterioração do calçamento" w:value="Deterioração do calçamento"/>
-                  <w:listItem w:displayText="Drenagem superficial ineficiente" w:value="Drenagem superficial ineficiente"/>
-                  <w:listItem w:displayText="Empolamento do revestimento" w:value="Empolamento do revestimento"/>
-                  <w:listItem w:displayText="Erosão do solo" w:value="Erosão do solo"/>
-                  <w:listItem w:displayText="Faixa de umidade persistente" w:value="Faixa de umidade persistente"/>
-                  <w:listItem w:displayText="Falha de aderência da pintura" w:value="Falha de aderência da pintura"/>
-                  <w:listItem w:displayText="Falha na vedação / soldagem das conecções" w:value="Falha na vedação / soldagem das conecções"/>
-                  <w:listItem w:displayText="Falha na vinculação de elementos" w:value="Falha na vinculação de elementos"/>
-                  <w:listItem w:displayText="Falta de calha de captação pluvial" w:value="Falta de calha de captação pluvial"/>
-                  <w:listItem w:displayText="Falta de dispositivo DR" w:value="Falta de dispositivo DR"/>
-                  <w:listItem w:displayText="Falta de piso tátil" w:value="Falta de piso tátil"/>
-                  <w:listItem w:displayText="Falta de rufo pingadeira" w:value="Falta de rufo pingadeira"/>
-                  <w:listItem w:displayText="Falta de sinalização visual" w:value="Falta de sinalização visual"/>
-                  <w:listItem w:displayText="Falta ou falha da faixa de travessia" w:value="Falta ou falha da faixa de travessia"/>
-                  <w:listItem w:displayText="Falta ou falha da pingadeira" w:value="Falta ou falha da pingadeira"/>
-                  <w:listItem w:displayText="Falta ou falha da rampa de acesso" w:value="Falta ou falha da rampa de acesso"/>
-                  <w:listItem w:displayText="Falta ou falha da vaga acessível" w:value="Falta ou falha da vaga acessível"/>
-                  <w:listItem w:displayText="Falta ou falha de corrimão" w:value="Falta ou falha de corrimão"/>
-                  <w:listItem w:displayText="Falta ou falha de vaga acessível" w:value="Falta ou falha de vaga acessível"/>
-                  <w:listItem w:displayText="Falta ou falha do guarda-corpo" w:value="Falta ou falha do guarda-corpo"/>
-                  <w:listItem w:displayText="Falta ou falha do peitoril" w:value="Falta ou falha do peitoril"/>
-                  <w:listItem w:displayText="Fissura higroscópica" w:value="Fissura higroscópica"/>
-                  <w:listItem w:displayText="Fissura mapeada" w:value="Fissura mapeada"/>
-                  <w:listItem w:displayText="Infiltração pela fachada" w:value="Infiltração pela fachada"/>
-                  <w:listItem w:displayText="Infiltração pelas esquadrias" w:value="Infiltração pelas esquadrias"/>
-                  <w:listItem w:displayText="Infiltração pelo cobogó" w:value="Infiltração pelo cobogó"/>
-                  <w:listItem w:displayText="Má instalação das janelas" w:value="Má instalação das janelas"/>
-                  <w:listItem w:displayText="Muro de arrimo-Falta de drenagem" w:value="Muro de arrimo-Falta de drenagem"/>
-                  <w:listItem w:displayText="Muro de arrimo-Trincas e deformações" w:value="Muro de arrimo-Trincas e deformações"/>
-                  <w:listItem w:displayText="Muro de divisa-Trincas, deformação, umidade, reboco" w:value="Muro de divisa-Trincas, deformação, umidade, reboco"/>
-                  <w:listItem w:displayText="Piso solto, trincado ou com som cavo" w:value="Piso solto, trincado ou com som cavo"/>
-                  <w:listItem w:displayText="Prolongamnto insuficiente do peitoril" w:value="Prolongamnto insuficiente do peitoril"/>
-                  <w:listItem w:displayText="Reboco em desacordo à NBR 13529" w:value="Reboco em desacordo à NBR 13529"/>
-                  <w:listItem w:displayText="Reboco em desacordo às NBRs 7298 / 13749" w:value="Reboco em desacordo às NBRs 7298 / 13749"/>
-                  <w:listItem w:displayText="Reparo inadequado" w:value="Reparo inadequado"/>
-                  <w:listItem w:displayText="Revestimento argamassado pulverulento" w:value="Revestimento argamassado pulverulento"/>
-                  <w:listItem w:displayText="Revestimento argamassado solto" w:value="Revestimento argamassado solto"/>
-                  <w:listItem w:displayText="Rufo nas platibandas" w:value="Rufo nas platibandas"/>
-                  <w:listItem w:displayText="Tampas em desacordo à NBR 8160" w:value="Tampas em desacordo à NBR 8160"/>
-                  <w:listItem w:displayText="Transpasse inadequado do peitoril" w:value="Transpasse inadequado do peitoril"/>
-                  <w:listItem w:displayText="Trinca contigua à esquadria" w:value="Trinca contigua à esquadria"/>
-                  <w:listItem w:displayText="Trinca devido à deformação estrutural" w:value="Trinca devido à deformação estrutural"/>
-                  <w:listItem w:displayText="Trinca entre a laje e alvenaria" w:value="Trinca entre a laje e alvenaria"/>
-                  <w:listItem w:displayText="Trinca horizontal" w:value="Trinca horizontal"/>
-                  <w:listItem w:displayText="Trinca na laje (hall)" w:value="Trinca na laje (hall)"/>
-                  <w:listItem w:displayText="Trinca no abrigo" w:value="Trinca no abrigo"/>
-                  <w:listItem w:displayText="Trinca no calçamento" w:value="Trinca no calçamento"/>
-                  <w:listItem w:displayText="Trinca no calçamento perimentral" w:value="Trinca no calçamento perimentral"/>
-                  <w:listItem w:displayText="Trinca saindo da janela" w:value="Trinca saindo da janela"/>
-                  <w:listItem w:displayText="Trinca saindo da porta" w:value="Trinca saindo da porta"/>
-                  <w:listItem w:displayText="Trinca vertical na alvenaria" w:value="Trinca vertical na alvenaria"/>
-                  <w:listItem w:displayText="Umidade ascendente" w:value="Umidade ascendente"/>
-                  <w:listItem w:displayText="Umidade na moldura" w:value="Umidade na moldura"/>
-                  <w:listItem w:displayText="Umidade no alçapão" w:value="Umidade no alçapão"/>
-                  <w:listItem w:displayText="Utilização de elemento não estanque (cobogo)" w:value="Utilização de elemento não estanque (cobogo)"/>
-                  <w:listItem w:displayText="Umidade na fachada" w:value="Umidade na fachada"/>
-                  <w:listItem w:displayText="Falha da impermeabilização das áreas molháveis" w:value="Falha da impermeabilização das áreas molháveis"/>
-                  <w:listItem w:displayText="Fissura na junta de dilatação" w:value="Fissura na junta de dilatação"/>
-                  <w:listItem w:displayText="Umidade nos frisos" w:value="Umidade nos frisos"/>
-                </w:comboBox>
-              </w:sdtPr>
-              <w:sdtContent>
-                <w:r>
-                  <w:rPr>
-                    <w:noProof/>
-                  </w:rPr>
-                  <w:t>Identificação</w:t>
-                </w:r>
-              </w:sdtContent>
-            </w:sdt>
-          </w:p>
-        </w:tc>
-        <w:tc>
-          <w:tcPr>
-            <w:tcW w:w="4589" w:type="dxa"/>
-            <w:tcBorders>
-              <w:top w:val="nil"/>
-              <w:left w:val="nil"/>
-              <w:bottom w:val="nil"/>
-              <w:right w:val="nil"/>
-            </w:tcBorders>
-          </w:tcPr>
-          <w:p>
-            <w:pPr>
-              <w:ind w:firstLine="0"/>
-              <w:jc w:val="center"/>
-            </w:pPr>
-            <w:r>
-              <w:rPr>
-                <w:noProof/>
-              </w:rPr>
-              <w:drawing>
-                <wp:inline distT="0" distB="0" distL="0" distR="0" wp14:anchorId="2A4783E4" wp14:editId="149B92C1">
-                  <wp:extent cx="2667000" cy="1917700"/>
-                  <wp:effectExtent l="0" t="0" r="0" b="6350"/>
-                  <wp:docPr id="1967927922" name="Imagem 1967927922"/>
-                  <wp:cNvGraphicFramePr>
-                    <a:graphicFrameLocks xmlns:a="http://schemas.openxmlformats.org/drawingml/2006/main"/>
-                  </wp:cNvGraphicFramePr>
-                  <a:graphic xmlns:a="http://schemas.openxmlformats.org/drawingml/2006/main">
-                    <a:graphicData uri="http://schemas.openxmlformats.org/drawingml/2006/picture">
-                      <pic:pic xmlns:pic="http://schemas.openxmlformats.org/drawingml/2006/picture">
-                        <pic:nvPicPr>
-                          <pic:cNvPr id="1" name=""/>
-                          <pic:cNvPicPr/>
-                        </pic:nvPicPr>
-                        <pic:blipFill>
-                          <a:blip r:embed="rId13"/>
-                          <a:stretch>
-                            <a:fillRect/>
-                          </a:stretch>
-                        </pic:blipFill>
-                        <pic:spPr>
-                          <a:xfrm>
-                            <a:off x="0" y="0"/>
-                            <a:ext cx="2667000" cy="1917700"/>
-                          </a:xfrm>
-                          <a:prstGeom prst="rect">
-                            <a:avLst/>
-                          </a:prstGeom>
-                        </pic:spPr>
-                      </pic:pic>
-                    </a:graphicData>
-                  </a:graphic>
-                </wp:inline>
-              </w:drawing>
-            </w:r>
-          </w:p>
-          <w:p>
-            <w:pPr>
-              <w:pStyle w:val="Legenda"/>
-            </w:pPr>
-            <w:r>
-              <w:t xml:space="preserve">Foto </w:t>
-            </w:r>
-            <w:r>
-              <w:rPr>
-                <w:noProof/>
-              </w:rPr>
-              <w:fldChar w:fldCharType="begin"/>
-            </w:r>
-            <w:r>
-              <w:rPr>
-                <w:noProof/>
-              </w:rPr>
-              <w:instrText xml:space="preserve"> SEQ Foto \* ARABIC </w:instrText>
-            </w:r>
-            <w:r>
-              <w:rPr>
-                <w:noProof/>
-              </w:rPr>
-              <w:fldChar w:fldCharType="separate"/>
-            </w:r>
-            <w:r>
-              <w:rPr>
-                <w:noProof/>
-              </w:rPr>
-              <w:t>20</w:t>
-            </w:r>
-            <w:r>
-              <w:rPr>
-                <w:noProof/>
-              </w:rPr>
-              <w:fldChar w:fldCharType="end"/>
-            </w:r>
-            <w:r>
-              <w:rPr>
-                <w:noProof/>
-              </w:rPr>
-              <w:t xml:space="preserve"> – </w:t>
-            </w:r>
-            <w:sdt>
-              <w:sdtPr>
-                <w:rPr>
-                  <w:noProof/>
-                </w:rPr>
-                <w:id w:val="447201938"/>
-                <w:placeholder>
-                  <w:docPart w:val="486B105B676940EF81049EA457D96BFA"/>
-                </w:placeholder>
-                <w:comboBox>
-                  <w:listItem w:displayText="Armadura exposta" w:value="Armadura exposta"/>
-                  <w:listItem w:displayText="Caixas de inspeção em desacordo à NBR 9050" w:value="Caixas de inspeção em desacordo à NBR 9050"/>
-                  <w:listItem w:displayText="Cobertura de acesso ao bloco" w:value="Cobertura de acesso ao bloco"/>
-                  <w:listItem w:displayText="Concreção ferruginosa" w:value="Concreção ferruginosa"/>
-                  <w:listItem w:displayText="Condutor em desacordo à NBR10844" w:value="Condutor em desacordo à NBR10844"/>
-                  <w:listItem w:displayText="Contenção-Talude" w:value="Contenção-Talude"/>
-                  <w:listItem w:displayText="Corrosão de elementos metálicos" w:value="Corrosão de elementos metálicos"/>
-                  <w:listItem w:displayText="Degraus em desacordo à NBR 9050" w:value="Degraus em desacordo à NBR 9050"/>
-                  <w:listItem w:displayText="Destelhamento" w:value="Destelhamento"/>
-                  <w:listItem w:displayText="Deterioração da pavimentação" w:value="Deterioração da pavimentação"/>
-                  <w:listItem w:displayText="Deterioração do calçamento" w:value="Deterioração do calçamento"/>
-                  <w:listItem w:displayText="Drenagem superficial ineficiente" w:value="Drenagem superficial ineficiente"/>
-                  <w:listItem w:displayText="Empolamento do revestimento" w:value="Empolamento do revestimento"/>
-                  <w:listItem w:displayText="Erosão do solo" w:value="Erosão do solo"/>
-                  <w:listItem w:displayText="Faixa de umidade persistente" w:value="Faixa de umidade persistente"/>
-                  <w:listItem w:displayText="Falha de aderência da pintura" w:value="Falha de aderência da pintura"/>
-                  <w:listItem w:displayText="Falha na vedação / soldagem das conecções" w:value="Falha na vedação / soldagem das conecções"/>
-                  <w:listItem w:displayText="Falha na vinculação de elementos" w:value="Falha na vinculação de elementos"/>
-                  <w:listItem w:displayText="Falta de calha de captação pluvial" w:value="Falta de calha de captação pluvial"/>
-                  <w:listItem w:displayText="Falta de dispositivo DR" w:value="Falta de dispositivo DR"/>
-                  <w:listItem w:displayText="Falta de piso tátil" w:value="Falta de piso tátil"/>
-                  <w:listItem w:displayText="Falta de rufo pingadeira" w:value="Falta de rufo pingadeira"/>
-                  <w:listItem w:displayText="Falta de sinalização visual" w:value="Falta de sinalização visual"/>
-                  <w:listItem w:displayText="Falta ou falha da faixa de travessia" w:value="Falta ou falha da faixa de travessia"/>
-                  <w:listItem w:displayText="Falta ou falha da pingadeira" w:value="Falta ou falha da pingadeira"/>
-                  <w:listItem w:displayText="Falta ou falha da rampa de acesso" w:value="Falta ou falha da rampa de acesso"/>
-                  <w:listItem w:displayText="Falta ou falha da vaga acessível" w:value="Falta ou falha da vaga acessível"/>
-                  <w:listItem w:displayText="Falta ou falha de corrimão" w:value="Falta ou falha de corrimão"/>
-                  <w:listItem w:displayText="Falta ou falha de vaga acessível" w:value="Falta ou falha de vaga acessível"/>
-                  <w:listItem w:displayText="Falta ou falha do guarda-corpo" w:value="Falta ou falha do guarda-corpo"/>
-                  <w:listItem w:displayText="Falta ou falha do peitoril" w:value="Falta ou falha do peitoril"/>
-                  <w:listItem w:displayText="Fissura higroscópica" w:value="Fissura higroscópica"/>
-                  <w:listItem w:displayText="Fissura mapeada" w:value="Fissura mapeada"/>
-                  <w:listItem w:displayText="Infiltração pela fachada" w:value="Infiltração pela fachada"/>
-                  <w:listItem w:displayText="Infiltração pelas esquadrias" w:value="Infiltração pelas esquadrias"/>
-                  <w:listItem w:displayText="Infiltração pelo cobogó" w:value="Infiltração pelo cobogó"/>
-                  <w:listItem w:displayText="Má instalação das janelas" w:value="Má instalação das janelas"/>
-                  <w:listItem w:displayText="Muro de arrimo-Falta de drenagem" w:value="Muro de arrimo-Falta de drenagem"/>
-                  <w:listItem w:displayText="Muro de arrimo-Trincas e deformações" w:value="Muro de arrimo-Trincas e deformações"/>
-                  <w:listItem w:displayText="Muro de divisa-Trincas, deformação, umidade, reboco" w:value="Muro de divisa-Trincas, deformação, umidade, reboco"/>
-                  <w:listItem w:displayText="Piso solto, trincado ou com som cavo" w:value="Piso solto, trincado ou com som cavo"/>
-                  <w:listItem w:displayText="Prolongamnto insuficiente do peitoril" w:value="Prolongamnto insuficiente do peitoril"/>
-                  <w:listItem w:displayText="Reboco em desacordo à NBR 13529" w:value="Reboco em desacordo à NBR 13529"/>
-                  <w:listItem w:displayText="Reboco em desacordo às NBRs 7298 / 13749" w:value="Reboco em desacordo às NBRs 7298 / 13749"/>
-                  <w:listItem w:displayText="Reparo inadequado" w:value="Reparo inadequado"/>
-                  <w:listItem w:displayText="Revestimento argamassado pulverulento" w:value="Revestimento argamassado pulverulento"/>
-                  <w:listItem w:displayText="Revestimento argamassado solto" w:value="Revestimento argamassado solto"/>
-                  <w:listItem w:displayText="Rufo nas platibandas" w:value="Rufo nas platibandas"/>
-                  <w:listItem w:displayText="Tampas em desacordo à NBR 8160" w:value="Tampas em desacordo à NBR 8160"/>
-                  <w:listItem w:displayText="Transpasse inadequado do peitoril" w:value="Transpasse inadequado do peitoril"/>
-                  <w:listItem w:displayText="Trinca contigua à esquadria" w:value="Trinca contigua à esquadria"/>
-                  <w:listItem w:displayText="Trinca devido à deformação estrutural" w:value="Trinca devido à deformação estrutural"/>
-                  <w:listItem w:displayText="Trinca entre a laje e alvenaria" w:value="Trinca entre a laje e alvenaria"/>
-                  <w:listItem w:displayText="Trinca horizontal" w:value="Trinca horizontal"/>
-                  <w:listItem w:displayText="Trinca na laje (hall)" w:value="Trinca na laje (hall)"/>
-                  <w:listItem w:displayText="Trinca no abrigo" w:value="Trinca no abrigo"/>
-                  <w:listItem w:displayText="Trinca no calçamento" w:value="Trinca no calçamento"/>
-                  <w:listItem w:displayText="Trinca no calçamento perimentral" w:value="Trinca no calçamento perimentral"/>
-                  <w:listItem w:displayText="Trinca saindo da janela" w:value="Trinca saindo da janela"/>
-                  <w:listItem w:displayText="Trinca saindo da porta" w:value="Trinca saindo da porta"/>
-                  <w:listItem w:displayText="Trinca vertical na alvenaria" w:value="Trinca vertical na alvenaria"/>
-                  <w:listItem w:displayText="Umidade ascendente" w:value="Umidade ascendente"/>
-                  <w:listItem w:displayText="Umidade na moldura" w:value="Umidade na moldura"/>
-                  <w:listItem w:displayText="Umidade no alçapão" w:value="Umidade no alçapão"/>
-                  <w:listItem w:displayText="Utilização de elemento não estanque (cobogo)" w:value="Utilização de elemento não estanque (cobogo)"/>
-                  <w:listItem w:displayText="Umidade na fachada" w:value="Umidade na fachada"/>
-                  <w:listItem w:displayText="Falha da impermeabilização das áreas molháveis" w:value="Falha da impermeabilização das áreas molháveis"/>
-                  <w:listItem w:displayText="Fissura na junta de dilatação" w:value="Fissura na junta de dilatação"/>
-                  <w:listItem w:displayText="Umidade nos frisos" w:value="Umidade nos frisos"/>
-                </w:comboBox>
-              </w:sdtPr>
-              <w:sdtContent>
-                <w:r>
-                  <w:rPr>
-                    <w:noProof/>
-                  </w:rPr>
-                  <w:t>Identificação</w:t>
-                </w:r>
-              </w:sdtContent>
-            </w:sdt>
-          </w:p>
-        </w:tc>
-      </w:tr>
-      <w:tr>
-        <w:tc>
-          <w:tcPr>
-            <w:tcW w:w="4589" w:type="dxa"/>
-            <w:tcBorders>
-              <w:top w:val="nil"/>
-              <w:left w:val="nil"/>
-              <w:bottom w:val="nil"/>
-              <w:right w:val="nil"/>
-            </w:tcBorders>
-          </w:tcPr>
-          <w:p>
-            <w:pPr>
-              <w:ind w:firstLine="0"/>
-              <w:jc w:val="center"/>
-            </w:pPr>
-            <w:r>
-              <w:rPr>
-                <w:noProof/>
-              </w:rPr>
-              <w:lastRenderedPageBreak/>
-              <w:drawing>
-                <wp:inline distT="0" distB="0" distL="0" distR="0" wp14:anchorId="2F59B02F" wp14:editId="1EC8CC26">
-                  <wp:extent cx="2667000" cy="1917700"/>
-                  <wp:effectExtent l="0" t="0" r="0" b="6350"/>
-                  <wp:docPr id="1915233601" name="Imagem 1915233601"/>
-                  <wp:cNvGraphicFramePr>
-                    <a:graphicFrameLocks xmlns:a="http://schemas.openxmlformats.org/drawingml/2006/main"/>
-                  </wp:cNvGraphicFramePr>
-                  <a:graphic xmlns:a="http://schemas.openxmlformats.org/drawingml/2006/main">
-                    <a:graphicData uri="http://schemas.openxmlformats.org/drawingml/2006/picture">
-                      <pic:pic xmlns:pic="http://schemas.openxmlformats.org/drawingml/2006/picture">
-                        <pic:nvPicPr>
-                          <pic:cNvPr id="1" name=""/>
-                          <pic:cNvPicPr/>
-                        </pic:nvPicPr>
-                        <pic:blipFill>
-                          <a:blip r:embed="rId12"/>
-                          <a:stretch>
-                            <a:fillRect/>
-                          </a:stretch>
-                        </pic:blipFill>
-                        <pic:spPr>
-                          <a:xfrm>
-                            <a:off x="0" y="0"/>
-                            <a:ext cx="2667000" cy="1917700"/>
-                          </a:xfrm>
-                          <a:prstGeom prst="rect">
-                            <a:avLst/>
-                          </a:prstGeom>
-                        </pic:spPr>
-                      </pic:pic>
-                    </a:graphicData>
-                  </a:graphic>
-                </wp:inline>
-              </w:drawing>
-            </w:r>
-          </w:p>
-          <w:p>
-            <w:pPr>
-              <w:pStyle w:val="Legenda"/>
-            </w:pPr>
-            <w:r>
-              <w:t xml:space="preserve">Foto </w:t>
-            </w:r>
-            <w:r>
-              <w:rPr>
-                <w:noProof/>
-              </w:rPr>
-              <w:fldChar w:fldCharType="begin"/>
-            </w:r>
-            <w:r>
-              <w:rPr>
-                <w:noProof/>
-              </w:rPr>
-              <w:instrText xml:space="preserve"> SEQ Foto \* ARABIC </w:instrText>
-            </w:r>
-            <w:r>
-              <w:rPr>
-                <w:noProof/>
-              </w:rPr>
-              <w:fldChar w:fldCharType="separate"/>
-            </w:r>
-            <w:r>
-              <w:rPr>
-                <w:noProof/>
-              </w:rPr>
-              <w:t>21</w:t>
-            </w:r>
-            <w:r>
-              <w:rPr>
-                <w:noProof/>
-              </w:rPr>
-              <w:fldChar w:fldCharType="end"/>
-            </w:r>
-            <w:r>
-              <w:rPr>
-                <w:noProof/>
-              </w:rPr>
-              <w:t xml:space="preserve"> – </w:t>
-            </w:r>
-            <w:sdt>
-              <w:sdtPr>
-                <w:rPr>
-                  <w:noProof/>
-                </w:rPr>
-                <w:id w:val="-1301152887"/>
-                <w:placeholder>
-                  <w:docPart w:val="1AE3EC2271F740BABE7C8F2B3C8F6D7F"/>
-                </w:placeholder>
-                <w:comboBox>
-                  <w:listItem w:displayText="Armadura exposta" w:value="Armadura exposta"/>
-                  <w:listItem w:displayText="Caixas de inspeção em desacordo à NBR 9050" w:value="Caixas de inspeção em desacordo à NBR 9050"/>
-                  <w:listItem w:displayText="Cobertura de acesso ao bloco" w:value="Cobertura de acesso ao bloco"/>
-                  <w:listItem w:displayText="Concreção ferruginosa" w:value="Concreção ferruginosa"/>
-                  <w:listItem w:displayText="Condutor em desacordo à NBR10844" w:value="Condutor em desacordo à NBR10844"/>
-                  <w:listItem w:displayText="Contenção-Talude" w:value="Contenção-Talude"/>
-                  <w:listItem w:displayText="Corrosão de elementos metálicos" w:value="Corrosão de elementos metálicos"/>
-                  <w:listItem w:displayText="Degraus em desacordo à NBR 9050" w:value="Degraus em desacordo à NBR 9050"/>
-                  <w:listItem w:displayText="Destelhamento" w:value="Destelhamento"/>
-                  <w:listItem w:displayText="Deterioração da pavimentação" w:value="Deterioração da pavimentação"/>
-                  <w:listItem w:displayText="Deterioração do calçamento" w:value="Deterioração do calçamento"/>
-                  <w:listItem w:displayText="Drenagem superficial ineficiente" w:value="Drenagem superficial ineficiente"/>
-                  <w:listItem w:displayText="Empolamento do revestimento" w:value="Empolamento do revestimento"/>
-                  <w:listItem w:displayText="Erosão do solo" w:value="Erosão do solo"/>
-                  <w:listItem w:displayText="Faixa de umidade persistente" w:value="Faixa de umidade persistente"/>
-                  <w:listItem w:displayText="Falha de aderência da pintura" w:value="Falha de aderência da pintura"/>
-                  <w:listItem w:displayText="Falha na vedação / soldagem das conecções" w:value="Falha na vedação / soldagem das conecções"/>
-                  <w:listItem w:displayText="Falha na vinculação de elementos" w:value="Falha na vinculação de elementos"/>
-                  <w:listItem w:displayText="Falta de calha de captação pluvial" w:value="Falta de calha de captação pluvial"/>
-                  <w:listItem w:displayText="Falta de dispositivo DR" w:value="Falta de dispositivo DR"/>
-                  <w:listItem w:displayText="Falta de piso tátil" w:value="Falta de piso tátil"/>
-                  <w:listItem w:displayText="Falta de rufo pingadeira" w:value="Falta de rufo pingadeira"/>
-                  <w:listItem w:displayText="Falta de sinalização visual" w:value="Falta de sinalização visual"/>
-                  <w:listItem w:displayText="Falta ou falha da faixa de travessia" w:value="Falta ou falha da faixa de travessia"/>
-                  <w:listItem w:displayText="Falta ou falha da pingadeira" w:value="Falta ou falha da pingadeira"/>
-                  <w:listItem w:displayText="Falta ou falha da rampa de acesso" w:value="Falta ou falha da rampa de acesso"/>
-                  <w:listItem w:displayText="Falta ou falha da vaga acessível" w:value="Falta ou falha da vaga acessível"/>
-                  <w:listItem w:displayText="Falta ou falha de corrimão" w:value="Falta ou falha de corrimão"/>
-                  <w:listItem w:displayText="Falta ou falha de vaga acessível" w:value="Falta ou falha de vaga acessível"/>
-                  <w:listItem w:displayText="Falta ou falha do guarda-corpo" w:value="Falta ou falha do guarda-corpo"/>
-                  <w:listItem w:displayText="Falta ou falha do peitoril" w:value="Falta ou falha do peitoril"/>
-                  <w:listItem w:displayText="Fissura higroscópica" w:value="Fissura higroscópica"/>
-                  <w:listItem w:displayText="Fissura mapeada" w:value="Fissura mapeada"/>
-                  <w:listItem w:displayText="Infiltração pela fachada" w:value="Infiltração pela fachada"/>
-                  <w:listItem w:displayText="Infiltração pelas esquadrias" w:value="Infiltração pelas esquadrias"/>
-                  <w:listItem w:displayText="Infiltração pelo cobogó" w:value="Infiltração pelo cobogó"/>
-                  <w:listItem w:displayText="Má instalação das janelas" w:value="Má instalação das janelas"/>
-                  <w:listItem w:displayText="Muro de arrimo-Falta de drenagem" w:value="Muro de arrimo-Falta de drenagem"/>
-                  <w:listItem w:displayText="Muro de arrimo-Trincas e deformações" w:value="Muro de arrimo-Trincas e deformações"/>
-                  <w:listItem w:displayText="Muro de divisa-Trincas, deformação, umidade, reboco" w:value="Muro de divisa-Trincas, deformação, umidade, reboco"/>
-                  <w:listItem w:displayText="Piso solto, trincado ou com som cavo" w:value="Piso solto, trincado ou com som cavo"/>
-                  <w:listItem w:displayText="Prolongamnto insuficiente do peitoril" w:value="Prolongamnto insuficiente do peitoril"/>
-                  <w:listItem w:displayText="Reboco em desacordo à NBR 13529" w:value="Reboco em desacordo à NBR 13529"/>
-                  <w:listItem w:displayText="Reboco em desacordo às NBRs 7298 / 13749" w:value="Reboco em desacordo às NBRs 7298 / 13749"/>
-                  <w:listItem w:displayText="Reparo inadequado" w:value="Reparo inadequado"/>
-                  <w:listItem w:displayText="Revestimento argamassado pulverulento" w:value="Revestimento argamassado pulverulento"/>
-                  <w:listItem w:displayText="Revestimento argamassado solto" w:value="Revestimento argamassado solto"/>
-                  <w:listItem w:displayText="Rufo nas platibandas" w:value="Rufo nas platibandas"/>
-                  <w:listItem w:displayText="Tampas em desacordo à NBR 8160" w:value="Tampas em desacordo à NBR 8160"/>
-                  <w:listItem w:displayText="Transpasse inadequado do peitoril" w:value="Transpasse inadequado do peitoril"/>
-                  <w:listItem w:displayText="Trinca contigua à esquadria" w:value="Trinca contigua à esquadria"/>
-                  <w:listItem w:displayText="Trinca devido à deformação estrutural" w:value="Trinca devido à deformação estrutural"/>
-                  <w:listItem w:displayText="Trinca entre a laje e alvenaria" w:value="Trinca entre a laje e alvenaria"/>
-                  <w:listItem w:displayText="Trinca horizontal" w:value="Trinca horizontal"/>
-                  <w:listItem w:displayText="Trinca na laje (hall)" w:value="Trinca na laje (hall)"/>
-                  <w:listItem w:displayText="Trinca no abrigo" w:value="Trinca no abrigo"/>
-                  <w:listItem w:displayText="Trinca no calçamento" w:value="Trinca no calçamento"/>
-                  <w:listItem w:displayText="Trinca no calçamento perimentral" w:value="Trinca no calçamento perimentral"/>
-                  <w:listItem w:displayText="Trinca saindo da janela" w:value="Trinca saindo da janela"/>
-                  <w:listItem w:displayText="Trinca saindo da porta" w:value="Trinca saindo da porta"/>
-                  <w:listItem w:displayText="Trinca vertical na alvenaria" w:value="Trinca vertical na alvenaria"/>
-                  <w:listItem w:displayText="Umidade ascendente" w:value="Umidade ascendente"/>
-                  <w:listItem w:displayText="Umidade na moldura" w:value="Umidade na moldura"/>
-                  <w:listItem w:displayText="Umidade no alçapão" w:value="Umidade no alçapão"/>
-                  <w:listItem w:displayText="Utilização de elemento não estanque (cobogo)" w:value="Utilização de elemento não estanque (cobogo)"/>
-                  <w:listItem w:displayText="Umidade na fachada" w:value="Umidade na fachada"/>
-                  <w:listItem w:displayText="Falha da impermeabilização das áreas molháveis" w:value="Falha da impermeabilização das áreas molháveis"/>
-                  <w:listItem w:displayText="Fissura na junta de dilatação" w:value="Fissura na junta de dilatação"/>
-                  <w:listItem w:displayText="Umidade nos frisos" w:value="Umidade nos frisos"/>
-                </w:comboBox>
-              </w:sdtPr>
-              <w:sdtContent>
-                <w:r>
-                  <w:rPr>
-                    <w:noProof/>
-                  </w:rPr>
-                  <w:t>Identificação</w:t>
-                </w:r>
-              </w:sdtContent>
-            </w:sdt>
-          </w:p>
-        </w:tc>
-        <w:tc>
-          <w:tcPr>
-            <w:tcW w:w="4589" w:type="dxa"/>
-            <w:tcBorders>
-              <w:top w:val="nil"/>
-              <w:left w:val="nil"/>
-              <w:bottom w:val="nil"/>
-              <w:right w:val="nil"/>
-            </w:tcBorders>
-          </w:tcPr>
-          <w:p>
-            <w:pPr>
-              <w:ind w:firstLine="0"/>
-              <w:jc w:val="center"/>
-            </w:pPr>
-            <w:r>
-              <w:rPr>
-                <w:noProof/>
-              </w:rPr>
-              <w:drawing>
-                <wp:inline distT="0" distB="0" distL="0" distR="0" wp14:anchorId="184C95D0" wp14:editId="4D1C1564">
-                  <wp:extent cx="2667000" cy="1917700"/>
-                  <wp:effectExtent l="0" t="0" r="0" b="6350"/>
-                  <wp:docPr id="1401101595" name="Imagem 1401101595"/>
-                  <wp:cNvGraphicFramePr>
-                    <a:graphicFrameLocks xmlns:a="http://schemas.openxmlformats.org/drawingml/2006/main"/>
-                  </wp:cNvGraphicFramePr>
-                  <a:graphic xmlns:a="http://schemas.openxmlformats.org/drawingml/2006/main">
-                    <a:graphicData uri="http://schemas.openxmlformats.org/drawingml/2006/picture">
-                      <pic:pic xmlns:pic="http://schemas.openxmlformats.org/drawingml/2006/picture">
-                        <pic:nvPicPr>
-                          <pic:cNvPr id="1" name=""/>
-                          <pic:cNvPicPr/>
-                        </pic:nvPicPr>
-                        <pic:blipFill>
-                          <a:blip r:embed="rId13"/>
-                          <a:stretch>
-                            <a:fillRect/>
-                          </a:stretch>
-                        </pic:blipFill>
-                        <pic:spPr>
-                          <a:xfrm>
-                            <a:off x="0" y="0"/>
-                            <a:ext cx="2667000" cy="1917700"/>
-                          </a:xfrm>
-                          <a:prstGeom prst="rect">
-                            <a:avLst/>
-                          </a:prstGeom>
-                        </pic:spPr>
-                      </pic:pic>
-                    </a:graphicData>
-                  </a:graphic>
-                </wp:inline>
-              </w:drawing>
-            </w:r>
-          </w:p>
-          <w:p>
-            <w:pPr>
-              <w:pStyle w:val="Legenda"/>
-            </w:pPr>
-            <w:r>
-              <w:t xml:space="preserve">Foto </w:t>
-            </w:r>
-            <w:r>
-              <w:rPr>
-                <w:noProof/>
-              </w:rPr>
-              <w:fldChar w:fldCharType="begin"/>
-            </w:r>
-            <w:r>
-              <w:rPr>
-                <w:noProof/>
-              </w:rPr>
-              <w:instrText xml:space="preserve"> SEQ Foto \* ARABIC </w:instrText>
-            </w:r>
-            <w:r>
-              <w:rPr>
-                <w:noProof/>
-              </w:rPr>
-              <w:fldChar w:fldCharType="separate"/>
-            </w:r>
-            <w:r>
-              <w:rPr>
-                <w:noProof/>
-              </w:rPr>
-              <w:t>22</w:t>
-            </w:r>
-            <w:r>
-              <w:rPr>
-                <w:noProof/>
-              </w:rPr>
-              <w:fldChar w:fldCharType="end"/>
-            </w:r>
-            <w:r>
-              <w:rPr>
-                <w:noProof/>
-              </w:rPr>
-              <w:t xml:space="preserve"> – </w:t>
-            </w:r>
-            <w:sdt>
-              <w:sdtPr>
-                <w:rPr>
-                  <w:noProof/>
-                </w:rPr>
-                <w:id w:val="881748726"/>
-                <w:placeholder>
-                  <w:docPart w:val="E07D092EB28949BDB47B7D260C32E35A"/>
-                </w:placeholder>
-                <w:comboBox>
-                  <w:listItem w:displayText="Armadura exposta" w:value="Armadura exposta"/>
-                  <w:listItem w:displayText="Caixas de inspeção em desacordo à NBR 9050" w:value="Caixas de inspeção em desacordo à NBR 9050"/>
-                  <w:listItem w:displayText="Cobertura de acesso ao bloco" w:value="Cobertura de acesso ao bloco"/>
-                  <w:listItem w:displayText="Concreção ferruginosa" w:value="Concreção ferruginosa"/>
-                  <w:listItem w:displayText="Condutor em desacordo à NBR10844" w:value="Condutor em desacordo à NBR10844"/>
-                  <w:listItem w:displayText="Contenção-Talude" w:value="Contenção-Talude"/>
-                  <w:listItem w:displayText="Corrosão de elementos metálicos" w:value="Corrosão de elementos metálicos"/>
-                  <w:listItem w:displayText="Degraus em desacordo à NBR 9050" w:value="Degraus em desacordo à NBR 9050"/>
-                  <w:listItem w:displayText="Destelhamento" w:value="Destelhamento"/>
-                  <w:listItem w:displayText="Deterioração da pavimentação" w:value="Deterioração da pavimentação"/>
-                  <w:listItem w:displayText="Deterioração do calçamento" w:value="Deterioração do calçamento"/>
-                  <w:listItem w:displayText="Drenagem superficial ineficiente" w:value="Drenagem superficial ineficiente"/>
-                  <w:listItem w:displayText="Empolamento do revestimento" w:value="Empolamento do revestimento"/>
-                  <w:listItem w:displayText="Erosão do solo" w:value="Erosão do solo"/>
-                  <w:listItem w:displayText="Faixa de umidade persistente" w:value="Faixa de umidade persistente"/>
-                  <w:listItem w:displayText="Falha de aderência da pintura" w:value="Falha de aderência da pintura"/>
-                  <w:listItem w:displayText="Falha na vedação / soldagem das conecções" w:value="Falha na vedação / soldagem das conecções"/>
-                  <w:listItem w:displayText="Falha na vinculação de elementos" w:value="Falha na vinculação de elementos"/>
-                  <w:listItem w:displayText="Falta de calha de captação pluvial" w:value="Falta de calha de captação pluvial"/>
-                  <w:listItem w:displayText="Falta de dispositivo DR" w:value="Falta de dispositivo DR"/>
-                  <w:listItem w:displayText="Falta de piso tátil" w:value="Falta de piso tátil"/>
-                  <w:listItem w:displayText="Falta de rufo pingadeira" w:value="Falta de rufo pingadeira"/>
-                  <w:listItem w:displayText="Falta de sinalização visual" w:value="Falta de sinalização visual"/>
-                  <w:listItem w:displayText="Falta ou falha da faixa de travessia" w:value="Falta ou falha da faixa de travessia"/>
-                  <w:listItem w:displayText="Falta ou falha da pingadeira" w:value="Falta ou falha da pingadeira"/>
-                  <w:listItem w:displayText="Falta ou falha da rampa de acesso" w:value="Falta ou falha da rampa de acesso"/>
-                  <w:listItem w:displayText="Falta ou falha da vaga acessível" w:value="Falta ou falha da vaga acessível"/>
-                  <w:listItem w:displayText="Falta ou falha de corrimão" w:value="Falta ou falha de corrimão"/>
-                  <w:listItem w:displayText="Falta ou falha de vaga acessível" w:value="Falta ou falha de vaga acessível"/>
-                  <w:listItem w:displayText="Falta ou falha do guarda-corpo" w:value="Falta ou falha do guarda-corpo"/>
-                  <w:listItem w:displayText="Falta ou falha do peitoril" w:value="Falta ou falha do peitoril"/>
-                  <w:listItem w:displayText="Fissura higroscópica" w:value="Fissura higroscópica"/>
-                  <w:listItem w:displayText="Fissura mapeada" w:value="Fissura mapeada"/>
-                  <w:listItem w:displayText="Infiltração pela fachada" w:value="Infiltração pela fachada"/>
-                  <w:listItem w:displayText="Infiltração pelas esquadrias" w:value="Infiltração pelas esquadrias"/>
-                  <w:listItem w:displayText="Infiltração pelo cobogó" w:value="Infiltração pelo cobogó"/>
-                  <w:listItem w:displayText="Má instalação das janelas" w:value="Má instalação das janelas"/>
-                  <w:listItem w:displayText="Muro de arrimo-Falta de drenagem" w:value="Muro de arrimo-Falta de drenagem"/>
-                  <w:listItem w:displayText="Muro de arrimo-Trincas e deformações" w:value="Muro de arrimo-Trincas e deformações"/>
-                  <w:listItem w:displayText="Muro de divisa-Trincas, deformação, umidade, reboco" w:value="Muro de divisa-Trincas, deformação, umidade, reboco"/>
-                  <w:listItem w:displayText="Piso solto, trincado ou com som cavo" w:value="Piso solto, trincado ou com som cavo"/>
-                  <w:listItem w:displayText="Prolongamnto insuficiente do peitoril" w:value="Prolongamnto insuficiente do peitoril"/>
-                  <w:listItem w:displayText="Reboco em desacordo à NBR 13529" w:value="Reboco em desacordo à NBR 13529"/>
-                  <w:listItem w:displayText="Reboco em desacordo às NBRs 7298 / 13749" w:value="Reboco em desacordo às NBRs 7298 / 13749"/>
-                  <w:listItem w:displayText="Reparo inadequado" w:value="Reparo inadequado"/>
-                  <w:listItem w:displayText="Revestimento argamassado pulverulento" w:value="Revestimento argamassado pulverulento"/>
-                  <w:listItem w:displayText="Revestimento argamassado solto" w:value="Revestimento argamassado solto"/>
-                  <w:listItem w:displayText="Rufo nas platibandas" w:value="Rufo nas platibandas"/>
-                  <w:listItem w:displayText="Tampas em desacordo à NBR 8160" w:value="Tampas em desacordo à NBR 8160"/>
-                  <w:listItem w:displayText="Transpasse inadequado do peitoril" w:value="Transpasse inadequado do peitoril"/>
-                  <w:listItem w:displayText="Trinca contigua à esquadria" w:value="Trinca contigua à esquadria"/>
-                  <w:listItem w:displayText="Trinca devido à deformação estrutural" w:value="Trinca devido à deformação estrutural"/>
-                  <w:listItem w:displayText="Trinca entre a laje e alvenaria" w:value="Trinca entre a laje e alvenaria"/>
-                  <w:listItem w:displayText="Trinca horizontal" w:value="Trinca horizontal"/>
-                  <w:listItem w:displayText="Trinca na laje (hall)" w:value="Trinca na laje (hall)"/>
-                  <w:listItem w:displayText="Trinca no abrigo" w:value="Trinca no abrigo"/>
-                  <w:listItem w:displayText="Trinca no calçamento" w:value="Trinca no calçamento"/>
-                  <w:listItem w:displayText="Trinca no calçamento perimentral" w:value="Trinca no calçamento perimentral"/>
-                  <w:listItem w:displayText="Trinca saindo da janela" w:value="Trinca saindo da janela"/>
-                  <w:listItem w:displayText="Trinca saindo da porta" w:value="Trinca saindo da porta"/>
-                  <w:listItem w:displayText="Trinca vertical na alvenaria" w:value="Trinca vertical na alvenaria"/>
-                  <w:listItem w:displayText="Umidade ascendente" w:value="Umidade ascendente"/>
-                  <w:listItem w:displayText="Umidade na moldura" w:value="Umidade na moldura"/>
-                  <w:listItem w:displayText="Umidade no alçapão" w:value="Umidade no alçapão"/>
-                  <w:listItem w:displayText="Utilização de elemento não estanque (cobogo)" w:value="Utilização de elemento não estanque (cobogo)"/>
-                  <w:listItem w:displayText="Umidade na fachada" w:value="Umidade na fachada"/>
-                  <w:listItem w:displayText="Falha da impermeabilização das áreas molháveis" w:value="Falha da impermeabilização das áreas molháveis"/>
-                  <w:listItem w:displayText="Fissura na junta de dilatação" w:value="Fissura na junta de dilatação"/>
-                  <w:listItem w:displayText="Umidade nos frisos" w:value="Umidade nos frisos"/>
-                </w:comboBox>
-              </w:sdtPr>
-              <w:sdtContent>
-                <w:r>
-                  <w:rPr>
-                    <w:noProof/>
-                  </w:rPr>
-                  <w:t>Identificação</w:t>
-                </w:r>
-              </w:sdtContent>
-            </w:sdt>
-          </w:p>
-        </w:tc>
-      </w:tr>
-      <w:tr>
-        <w:tc>
-          <w:tcPr>
-            <w:tcW w:w="4589" w:type="dxa"/>
-            <w:tcBorders>
-              <w:top w:val="nil"/>
-              <w:left w:val="nil"/>
-              <w:bottom w:val="nil"/>
-              <w:right w:val="nil"/>
-            </w:tcBorders>
-          </w:tcPr>
-          <w:p>
-            <w:pPr>
-              <w:ind w:firstLine="0"/>
-              <w:jc w:val="center"/>
-            </w:pPr>
-            <w:r>
-              <w:rPr>
-                <w:noProof/>
-              </w:rPr>
-              <w:drawing>
-                <wp:inline distT="0" distB="0" distL="0" distR="0" wp14:anchorId="496D8C72" wp14:editId="0AB1D991">
-                  <wp:extent cx="2667000" cy="1917700"/>
-                  <wp:effectExtent l="0" t="0" r="0" b="6350"/>
-                  <wp:docPr id="627053511" name="Imagem 627053511"/>
-                  <wp:cNvGraphicFramePr>
-                    <a:graphicFrameLocks xmlns:a="http://schemas.openxmlformats.org/drawingml/2006/main"/>
-                  </wp:cNvGraphicFramePr>
-                  <a:graphic xmlns:a="http://schemas.openxmlformats.org/drawingml/2006/main">
-                    <a:graphicData uri="http://schemas.openxmlformats.org/drawingml/2006/picture">
-                      <pic:pic xmlns:pic="http://schemas.openxmlformats.org/drawingml/2006/picture">
-                        <pic:nvPicPr>
-                          <pic:cNvPr id="1" name=""/>
-                          <pic:cNvPicPr/>
-                        </pic:nvPicPr>
-                        <pic:blipFill>
-                          <a:blip r:embed="rId12"/>
-                          <a:stretch>
-                            <a:fillRect/>
-                          </a:stretch>
-                        </pic:blipFill>
-                        <pic:spPr>
-                          <a:xfrm>
-                            <a:off x="0" y="0"/>
-                            <a:ext cx="2667000" cy="1917700"/>
-                          </a:xfrm>
-                          <a:prstGeom prst="rect">
-                            <a:avLst/>
-                          </a:prstGeom>
-                        </pic:spPr>
-                      </pic:pic>
-                    </a:graphicData>
-                  </a:graphic>
-                </wp:inline>
-              </w:drawing>
-            </w:r>
-          </w:p>
-          <w:p>
-            <w:pPr>
-              <w:pStyle w:val="Legenda"/>
-            </w:pPr>
-            <w:r>
-              <w:t xml:space="preserve">Foto </w:t>
-            </w:r>
-            <w:r>
-              <w:rPr>
-                <w:noProof/>
-              </w:rPr>
-              <w:fldChar w:fldCharType="begin"/>
-            </w:r>
-            <w:r>
-              <w:rPr>
-                <w:noProof/>
-              </w:rPr>
-              <w:instrText xml:space="preserve"> SEQ Foto \* ARABIC </w:instrText>
-            </w:r>
-            <w:r>
-              <w:rPr>
-                <w:noProof/>
-              </w:rPr>
-              <w:fldChar w:fldCharType="separate"/>
-            </w:r>
-            <w:r>
-              <w:rPr>
-                <w:noProof/>
-              </w:rPr>
-              <w:t>23</w:t>
-            </w:r>
-            <w:r>
-              <w:rPr>
-                <w:noProof/>
-              </w:rPr>
-              <w:fldChar w:fldCharType="end"/>
-            </w:r>
-            <w:r>
-              <w:rPr>
-                <w:noProof/>
-              </w:rPr>
-              <w:t xml:space="preserve"> – </w:t>
-            </w:r>
-            <w:sdt>
-              <w:sdtPr>
-                <w:rPr>
-                  <w:noProof/>
-                </w:rPr>
-                <w:id w:val="-938132787"/>
-                <w:placeholder>
-                  <w:docPart w:val="E07DFA7586A54E4FBF6739BA0103AA24"/>
-                </w:placeholder>
-                <w:comboBox>
-                  <w:listItem w:displayText="Armadura exposta" w:value="Armadura exposta"/>
-                  <w:listItem w:displayText="Caixas de inspeção em desacordo à NBR 9050" w:value="Caixas de inspeção em desacordo à NBR 9050"/>
-                  <w:listItem w:displayText="Cobertura de acesso ao bloco" w:value="Cobertura de acesso ao bloco"/>
-                  <w:listItem w:displayText="Concreção ferruginosa" w:value="Concreção ferruginosa"/>
-                  <w:listItem w:displayText="Condutor em desacordo à NBR10844" w:value="Condutor em desacordo à NBR10844"/>
-                  <w:listItem w:displayText="Contenção-Talude" w:value="Contenção-Talude"/>
-                  <w:listItem w:displayText="Corrosão de elementos metálicos" w:value="Corrosão de elementos metálicos"/>
-                  <w:listItem w:displayText="Degraus em desacordo à NBR 9050" w:value="Degraus em desacordo à NBR 9050"/>
-                  <w:listItem w:displayText="Destelhamento" w:value="Destelhamento"/>
-                  <w:listItem w:displayText="Deterioração da pavimentação" w:value="Deterioração da pavimentação"/>
-                  <w:listItem w:displayText="Deterioração do calçamento" w:value="Deterioração do calçamento"/>
-                  <w:listItem w:displayText="Drenagem superficial ineficiente" w:value="Drenagem superficial ineficiente"/>
-                  <w:listItem w:displayText="Empolamento do revestimento" w:value="Empolamento do revestimento"/>
-                  <w:listItem w:displayText="Erosão do solo" w:value="Erosão do solo"/>
-                  <w:listItem w:displayText="Faixa de umidade persistente" w:value="Faixa de umidade persistente"/>
-                  <w:listItem w:displayText="Falha de aderência da pintura" w:value="Falha de aderência da pintura"/>
-                  <w:listItem w:displayText="Falha na vedação / soldagem das conecções" w:value="Falha na vedação / soldagem das conecções"/>
-                  <w:listItem w:displayText="Falha na vinculação de elementos" w:value="Falha na vinculação de elementos"/>
-                  <w:listItem w:displayText="Falta de calha de captação pluvial" w:value="Falta de calha de captação pluvial"/>
-                  <w:listItem w:displayText="Falta de dispositivo DR" w:value="Falta de dispositivo DR"/>
-                  <w:listItem w:displayText="Falta de piso tátil" w:value="Falta de piso tátil"/>
-                  <w:listItem w:displayText="Falta de rufo pingadeira" w:value="Falta de rufo pingadeira"/>
-                  <w:listItem w:displayText="Falta de sinalização visual" w:value="Falta de sinalização visual"/>
-                  <w:listItem w:displayText="Falta ou falha da faixa de travessia" w:value="Falta ou falha da faixa de travessia"/>
-                  <w:listItem w:displayText="Falta ou falha da pingadeira" w:value="Falta ou falha da pingadeira"/>
-                  <w:listItem w:displayText="Falta ou falha da rampa de acesso" w:value="Falta ou falha da rampa de acesso"/>
-                  <w:listItem w:displayText="Falta ou falha da vaga acessível" w:value="Falta ou falha da vaga acessível"/>
-                  <w:listItem w:displayText="Falta ou falha de corrimão" w:value="Falta ou falha de corrimão"/>
-                  <w:listItem w:displayText="Falta ou falha de vaga acessível" w:value="Falta ou falha de vaga acessível"/>
-                  <w:listItem w:displayText="Falta ou falha do guarda-corpo" w:value="Falta ou falha do guarda-corpo"/>
-                  <w:listItem w:displayText="Falta ou falha do peitoril" w:value="Falta ou falha do peitoril"/>
-                  <w:listItem w:displayText="Fissura higroscópica" w:value="Fissura higroscópica"/>
-                  <w:listItem w:displayText="Fissura mapeada" w:value="Fissura mapeada"/>
-                  <w:listItem w:displayText="Infiltração pela fachada" w:value="Infiltração pela fachada"/>
-                  <w:listItem w:displayText="Infiltração pelas esquadrias" w:value="Infiltração pelas esquadrias"/>
-                  <w:listItem w:displayText="Infiltração pelo cobogó" w:value="Infiltração pelo cobogó"/>
-                  <w:listItem w:displayText="Má instalação das janelas" w:value="Má instalação das janelas"/>
-                  <w:listItem w:displayText="Muro de arrimo-Falta de drenagem" w:value="Muro de arrimo-Falta de drenagem"/>
-                  <w:listItem w:displayText="Muro de arrimo-Trincas e deformações" w:value="Muro de arrimo-Trincas e deformações"/>
-                  <w:listItem w:displayText="Muro de divisa-Trincas, deformação, umidade, reboco" w:value="Muro de divisa-Trincas, deformação, umidade, reboco"/>
-                  <w:listItem w:displayText="Piso solto, trincado ou com som cavo" w:value="Piso solto, trincado ou com som cavo"/>
-                  <w:listItem w:displayText="Prolongamnto insuficiente do peitoril" w:value="Prolongamnto insuficiente do peitoril"/>
-                  <w:listItem w:displayText="Reboco em desacordo à NBR 13529" w:value="Reboco em desacordo à NBR 13529"/>
-                  <w:listItem w:displayText="Reboco em desacordo às NBRs 7298 / 13749" w:value="Reboco em desacordo às NBRs 7298 / 13749"/>
-                  <w:listItem w:displayText="Reparo inadequado" w:value="Reparo inadequado"/>
-                  <w:listItem w:displayText="Revestimento argamassado pulverulento" w:value="Revestimento argamassado pulverulento"/>
-                  <w:listItem w:displayText="Revestimento argamassado solto" w:value="Revestimento argamassado solto"/>
-                  <w:listItem w:displayText="Rufo nas platibandas" w:value="Rufo nas platibandas"/>
-                  <w:listItem w:displayText="Tampas em desacordo à NBR 8160" w:value="Tampas em desacordo à NBR 8160"/>
-                  <w:listItem w:displayText="Transpasse inadequado do peitoril" w:value="Transpasse inadequado do peitoril"/>
-                  <w:listItem w:displayText="Trinca contigua à esquadria" w:value="Trinca contigua à esquadria"/>
-                  <w:listItem w:displayText="Trinca devido à deformação estrutural" w:value="Trinca devido à deformação estrutural"/>
-                  <w:listItem w:displayText="Trinca entre a laje e alvenaria" w:value="Trinca entre a laje e alvenaria"/>
-                  <w:listItem w:displayText="Trinca horizontal" w:value="Trinca horizontal"/>
-                  <w:listItem w:displayText="Trinca na laje (hall)" w:value="Trinca na laje (hall)"/>
-                  <w:listItem w:displayText="Trinca no abrigo" w:value="Trinca no abrigo"/>
-                  <w:listItem w:displayText="Trinca no calçamento" w:value="Trinca no calçamento"/>
-                  <w:listItem w:displayText="Trinca no calçamento perimentral" w:value="Trinca no calçamento perimentral"/>
-                  <w:listItem w:displayText="Trinca saindo da janela" w:value="Trinca saindo da janela"/>
-                  <w:listItem w:displayText="Trinca saindo da porta" w:value="Trinca saindo da porta"/>
-                  <w:listItem w:displayText="Trinca vertical na alvenaria" w:value="Trinca vertical na alvenaria"/>
-                  <w:listItem w:displayText="Umidade ascendente" w:value="Umidade ascendente"/>
-                  <w:listItem w:displayText="Umidade na moldura" w:value="Umidade na moldura"/>
-                  <w:listItem w:displayText="Umidade no alçapão" w:value="Umidade no alçapão"/>
-                  <w:listItem w:displayText="Utilização de elemento não estanque (cobogo)" w:value="Utilização de elemento não estanque (cobogo)"/>
-                  <w:listItem w:displayText="Umidade na fachada" w:value="Umidade na fachada"/>
-                  <w:listItem w:displayText="Falha da impermeabilização das áreas molháveis" w:value="Falha da impermeabilização das áreas molháveis"/>
-                  <w:listItem w:displayText="Fissura na junta de dilatação" w:value="Fissura na junta de dilatação"/>
-                  <w:listItem w:displayText="Umidade nos frisos" w:value="Umidade nos frisos"/>
-                </w:comboBox>
-              </w:sdtPr>
-              <w:sdtContent>
-                <w:r>
-                  <w:rPr>
-                    <w:noProof/>
-                  </w:rPr>
-                  <w:t>Identificação</w:t>
-                </w:r>
-              </w:sdtContent>
-            </w:sdt>
-          </w:p>
-        </w:tc>
-        <w:tc>
-          <w:tcPr>
-            <w:tcW w:w="4589" w:type="dxa"/>
-            <w:tcBorders>
-              <w:top w:val="nil"/>
-              <w:left w:val="nil"/>
-              <w:bottom w:val="nil"/>
-              <w:right w:val="nil"/>
-            </w:tcBorders>
-          </w:tcPr>
-          <w:p>
-            <w:pPr>
-              <w:ind w:firstLine="0"/>
-              <w:jc w:val="center"/>
-            </w:pPr>
-            <w:r>
-              <w:rPr>
-                <w:noProof/>
-              </w:rPr>
-              <w:drawing>
-                <wp:inline distT="0" distB="0" distL="0" distR="0" wp14:anchorId="63F45595" wp14:editId="2F842107">
-                  <wp:extent cx="2667000" cy="1917700"/>
-                  <wp:effectExtent l="0" t="0" r="0" b="6350"/>
-                  <wp:docPr id="379561387" name="Imagem 379561387"/>
-                  <wp:cNvGraphicFramePr>
-                    <a:graphicFrameLocks xmlns:a="http://schemas.openxmlformats.org/drawingml/2006/main"/>
-                  </wp:cNvGraphicFramePr>
-                  <a:graphic xmlns:a="http://schemas.openxmlformats.org/drawingml/2006/main">
-                    <a:graphicData uri="http://schemas.openxmlformats.org/drawingml/2006/picture">
-                      <pic:pic xmlns:pic="http://schemas.openxmlformats.org/drawingml/2006/picture">
-                        <pic:nvPicPr>
-                          <pic:cNvPr id="1" name=""/>
-                          <pic:cNvPicPr/>
-                        </pic:nvPicPr>
-                        <pic:blipFill>
-                          <a:blip r:embed="rId13"/>
-                          <a:stretch>
-                            <a:fillRect/>
-                          </a:stretch>
-                        </pic:blipFill>
-                        <pic:spPr>
-                          <a:xfrm>
-                            <a:off x="0" y="0"/>
-                            <a:ext cx="2667000" cy="1917700"/>
-                          </a:xfrm>
-                          <a:prstGeom prst="rect">
-                            <a:avLst/>
-                          </a:prstGeom>
-                        </pic:spPr>
-                      </pic:pic>
-                    </a:graphicData>
-                  </a:graphic>
-                </wp:inline>
-              </w:drawing>
-            </w:r>
-          </w:p>
-          <w:p>
-            <w:pPr>
-              <w:pStyle w:val="Legenda"/>
-            </w:pPr>
-            <w:r>
-              <w:t xml:space="preserve">Foto </w:t>
-            </w:r>
-            <w:r>
-              <w:rPr>
-                <w:noProof/>
-              </w:rPr>
-              <w:fldChar w:fldCharType="begin"/>
-            </w:r>
-            <w:r>
-              <w:rPr>
-                <w:noProof/>
-              </w:rPr>
-              <w:instrText xml:space="preserve"> SEQ Foto \* ARABIC </w:instrText>
-            </w:r>
-            <w:r>
-              <w:rPr>
-                <w:noProof/>
-              </w:rPr>
-              <w:fldChar w:fldCharType="separate"/>
-            </w:r>
-            <w:r>
-              <w:rPr>
-                <w:noProof/>
-              </w:rPr>
-              <w:t>24</w:t>
-            </w:r>
-            <w:r>
-              <w:rPr>
-                <w:noProof/>
-              </w:rPr>
-              <w:fldChar w:fldCharType="end"/>
-            </w:r>
-            <w:r>
-              <w:rPr>
-                <w:noProof/>
-              </w:rPr>
-              <w:t xml:space="preserve"> – </w:t>
-            </w:r>
-            <w:sdt>
-              <w:sdtPr>
-                <w:rPr>
-                  <w:noProof/>
-                </w:rPr>
-                <w:id w:val="187798341"/>
-                <w:placeholder>
-                  <w:docPart w:val="555918F2349547278B6B8F7F95BDD5F0"/>
+                  <w:docPart w:val="9A17C81155104F6AB0B1E948D500FE05"/>
                 </w:placeholder>
                 <w:comboBox>
                   <w:listItem w:displayText="Armadura exposta" w:value="Armadura exposta"/>
@@ -5083,9 +3548,10 @@
       <w:footerReference w:type="first" r:id="rId16"/>
       <w:type w:val="continuous"/>
       <w:pgSz w:w="11906" w:h="16838"/>
-      <w:pgMar w:top="1418" w:right="1418" w:bottom="1134" w:left="1418" w:header="227" w:footer="238" w:gutter="0"/>
+      <w:pgMar w:top="1134" w:right="1418" w:bottom="1134" w:left="1418" w:header="227" w:footer="238" w:gutter="0"/>
       <w:cols w:space="720"/>
       <w:titlePg/>
+      <w:docGrid w:linePitch="326"/>
     </w:sectPr>
   </w:body>
 </w:document>
@@ -8122,6 +6588,127 @@
     </w:lvl>
   </w:abstractNum>
   <w:abstractNum w:abstractNumId="22" w15:restartNumberingAfterBreak="0">
+    <w:nsid w:val="64C356D3"/>
+    <w:multiLevelType w:val="multilevel"/>
+    <w:tmpl w:val="0BD0988C"/>
+    <w:lvl w:ilvl="0">
+      <w:start w:val="1"/>
+      <w:numFmt w:val="decimal"/>
+      <w:lvlText w:val="%1."/>
+      <w:lvlJc w:val="left"/>
+      <w:pPr>
+        <w:ind w:left="720" w:hanging="360"/>
+      </w:pPr>
+      <w:rPr>
+        <w:rFonts w:hint="default"/>
+      </w:rPr>
+    </w:lvl>
+    <w:lvl w:ilvl="1">
+      <w:start w:val="1"/>
+      <w:numFmt w:val="decimal"/>
+      <w:isLgl/>
+      <w:lvlText w:val="%1.%2."/>
+      <w:lvlJc w:val="left"/>
+      <w:pPr>
+        <w:ind w:left="1080" w:hanging="720"/>
+      </w:pPr>
+      <w:rPr>
+        <w:rFonts w:hint="default"/>
+      </w:rPr>
+    </w:lvl>
+    <w:lvl w:ilvl="2">
+      <w:start w:val="1"/>
+      <w:numFmt w:val="decimal"/>
+      <w:isLgl/>
+      <w:lvlText w:val="%1.%2.%3."/>
+      <w:lvlJc w:val="left"/>
+      <w:pPr>
+        <w:ind w:left="1440" w:hanging="1080"/>
+      </w:pPr>
+      <w:rPr>
+        <w:rFonts w:hint="default"/>
+      </w:rPr>
+    </w:lvl>
+    <w:lvl w:ilvl="3">
+      <w:start w:val="1"/>
+      <w:numFmt w:val="decimal"/>
+      <w:isLgl/>
+      <w:lvlText w:val="%1.%2.%3.%4."/>
+      <w:lvlJc w:val="left"/>
+      <w:pPr>
+        <w:ind w:left="1440" w:hanging="1080"/>
+      </w:pPr>
+      <w:rPr>
+        <w:rFonts w:hint="default"/>
+      </w:rPr>
+    </w:lvl>
+    <w:lvl w:ilvl="4">
+      <w:start w:val="1"/>
+      <w:numFmt w:val="decimal"/>
+      <w:isLgl/>
+      <w:lvlText w:val="%1.%2.%3.%4.%5."/>
+      <w:lvlJc w:val="left"/>
+      <w:pPr>
+        <w:ind w:left="1800" w:hanging="1440"/>
+      </w:pPr>
+      <w:rPr>
+        <w:rFonts w:hint="default"/>
+      </w:rPr>
+    </w:lvl>
+    <w:lvl w:ilvl="5">
+      <w:start w:val="1"/>
+      <w:numFmt w:val="decimal"/>
+      <w:isLgl/>
+      <w:lvlText w:val="%1.%2.%3.%4.%5.%6."/>
+      <w:lvlJc w:val="left"/>
+      <w:pPr>
+        <w:ind w:left="2160" w:hanging="1800"/>
+      </w:pPr>
+      <w:rPr>
+        <w:rFonts w:hint="default"/>
+      </w:rPr>
+    </w:lvl>
+    <w:lvl w:ilvl="6">
+      <w:start w:val="1"/>
+      <w:numFmt w:val="decimal"/>
+      <w:isLgl/>
+      <w:lvlText w:val="%1.%2.%3.%4.%5.%6.%7."/>
+      <w:lvlJc w:val="left"/>
+      <w:pPr>
+        <w:ind w:left="2160" w:hanging="1800"/>
+      </w:pPr>
+      <w:rPr>
+        <w:rFonts w:hint="default"/>
+      </w:rPr>
+    </w:lvl>
+    <w:lvl w:ilvl="7">
+      <w:start w:val="1"/>
+      <w:numFmt w:val="decimal"/>
+      <w:isLgl/>
+      <w:lvlText w:val="%1.%2.%3.%4.%5.%6.%7.%8."/>
+      <w:lvlJc w:val="left"/>
+      <w:pPr>
+        <w:ind w:left="2520" w:hanging="2160"/>
+      </w:pPr>
+      <w:rPr>
+        <w:rFonts w:hint="default"/>
+      </w:rPr>
+    </w:lvl>
+    <w:lvl w:ilvl="8">
+      <w:start w:val="1"/>
+      <w:numFmt w:val="decimal"/>
+      <w:isLgl/>
+      <w:lvlText w:val="%1.%2.%3.%4.%5.%6.%7.%8.%9."/>
+      <w:lvlJc w:val="left"/>
+      <w:pPr>
+        <w:ind w:left="2880" w:hanging="2520"/>
+      </w:pPr>
+      <w:rPr>
+        <w:rFonts w:hint="default"/>
+      </w:rPr>
+    </w:lvl>
+  </w:abstractNum>
+  <w:abstractNum w:abstractNumId="23" w15:restartNumberingAfterBreak="0">
     <w:nsid w:val="6CF8413E"/>
     <w:multiLevelType w:val="multilevel"/>
     <w:tmpl w:val="645EF8DE"/>
@@ -8240,7 +6827,7 @@
       </w:rPr>
     </w:lvl>
   </w:abstractNum>
-  <w:abstractNum w:abstractNumId="23" w15:restartNumberingAfterBreak="0">
+  <w:abstractNum w:abstractNumId="24" w15:restartNumberingAfterBreak="0">
     <w:nsid w:val="717434CC"/>
     <w:multiLevelType w:val="multilevel"/>
     <w:tmpl w:val="645EF8DE"/>
@@ -8359,7 +6946,7 @@
       </w:rPr>
     </w:lvl>
   </w:abstractNum>
-  <w:abstractNum w:abstractNumId="24" w15:restartNumberingAfterBreak="0">
+  <w:abstractNum w:abstractNumId="25" w15:restartNumberingAfterBreak="0">
     <w:nsid w:val="71966806"/>
     <w:multiLevelType w:val="multilevel"/>
     <w:tmpl w:val="645EF8DE"/>
@@ -8478,7 +7065,7 @@
       </w:rPr>
     </w:lvl>
   </w:abstractNum>
-  <w:abstractNum w:abstractNumId="25" w15:restartNumberingAfterBreak="0">
+  <w:abstractNum w:abstractNumId="26" w15:restartNumberingAfterBreak="0">
     <w:nsid w:val="7C145484"/>
     <w:multiLevelType w:val="multilevel"/>
     <w:tmpl w:val="645EF8DE"/>
@@ -8597,7 +7184,7 @@
       </w:rPr>
     </w:lvl>
   </w:abstractNum>
-  <w:abstractNum w:abstractNumId="26" w15:restartNumberingAfterBreak="0">
+  <w:abstractNum w:abstractNumId="27" w15:restartNumberingAfterBreak="0">
     <w:nsid w:val="7D0740EF"/>
     <w:multiLevelType w:val="multilevel"/>
     <w:tmpl w:val="645EF8DE"/>
@@ -8747,7 +7334,7 @@
     <w:abstractNumId w:val="21"/>
   </w:num>
   <w:num w:numId="11" w16cid:durableId="1057316773">
-    <w:abstractNumId w:val="22"/>
+    <w:abstractNumId w:val="23"/>
   </w:num>
   <w:num w:numId="12" w16cid:durableId="1048723222">
     <w:abstractNumId w:val="7"/>
@@ -8756,10 +7343,10 @@
     <w:abstractNumId w:val="12"/>
   </w:num>
   <w:num w:numId="14" w16cid:durableId="1259022020">
-    <w:abstractNumId w:val="26"/>
+    <w:abstractNumId w:val="27"/>
   </w:num>
   <w:num w:numId="15" w16cid:durableId="408119089">
-    <w:abstractNumId w:val="23"/>
+    <w:abstractNumId w:val="24"/>
   </w:num>
   <w:num w:numId="16" w16cid:durableId="51393431">
     <w:abstractNumId w:val="9"/>
@@ -8774,7 +7361,7 @@
     <w:abstractNumId w:val="4"/>
   </w:num>
   <w:num w:numId="20" w16cid:durableId="552497082">
-    <w:abstractNumId w:val="25"/>
+    <w:abstractNumId w:val="26"/>
   </w:num>
   <w:num w:numId="21" w16cid:durableId="1122383342">
     <w:abstractNumId w:val="10"/>
@@ -8783,7 +7370,7 @@
     <w:abstractNumId w:val="19"/>
   </w:num>
   <w:num w:numId="23" w16cid:durableId="1721902612">
-    <w:abstractNumId w:val="24"/>
+    <w:abstractNumId w:val="25"/>
   </w:num>
   <w:num w:numId="24" w16cid:durableId="1275405475">
     <w:abstractNumId w:val="6"/>
@@ -8976,6 +7563,9 @@
     <w:lvlOverride w:ilvl="8">
       <w:startOverride w:val="1"/>
     </w:lvlOverride>
+  </w:num>
+  <w:num w:numId="34" w16cid:durableId="331300511">
+    <w:abstractNumId w:val="22"/>
   </w:num>
   <w:numIdMacAtCleanup w:val="4"/>
 </w:numbering>
@@ -9381,7 +7971,7 @@
   <w:style w:type="paragraph" w:default="1" w:styleId="Normal">
     <w:name w:val="Normal"/>
     <w:qFormat/>
-    <w:rsid w:val="00D33D47"/>
+    <w:rsid w:val="00A810B1"/>
     <w:rPr>
       <w:rFonts w:eastAsiaTheme="minorEastAsia"/>
     </w:rPr>
@@ -15176,7 +13766,7 @@
     </w:docPart>
     <w:docPart>
       <w:docPartPr>
-        <w:name w:val="C01BA29ABC29466688E938D784992E30"/>
+        <w:name w:val="5833024B207F4EFD8792C8948A368941"/>
         <w:category>
           <w:name w:val="Geral"/>
           <w:gallery w:val="placeholder"/>
@@ -15187,12 +13777,12 @@
         <w:behaviors>
           <w:behavior w:val="content"/>
         </w:behaviors>
-        <w:guid w:val="{B2F4C745-21DF-4A3A-9D03-9F448DBB006D}"/>
+        <w:guid w:val="{A119F6FA-19E9-4FE6-89C3-0C53A4567F78}"/>
       </w:docPartPr>
       <w:docPartBody>
         <w:p>
           <w:pPr>
-            <w:pStyle w:val="C01BA29ABC29466688E938D784992E30"/>
+            <w:pStyle w:val="5833024B207F4EFD8792C8948A368941"/>
           </w:pPr>
           <w:r>
             <w:rPr>
@@ -15205,7 +13795,7 @@
     </w:docPart>
     <w:docPart>
       <w:docPartPr>
-        <w:name w:val="C20C8B319277421EB530D9588D2715C0"/>
+        <w:name w:val="2B3BF47EF2D44E97A0B3C672BD025E58"/>
         <w:category>
           <w:name w:val="Geral"/>
           <w:gallery w:val="placeholder"/>
@@ -15216,12 +13806,12 @@
         <w:behaviors>
           <w:behavior w:val="content"/>
         </w:behaviors>
-        <w:guid w:val="{FD067038-81BF-414F-8DEE-6135794389BC}"/>
+        <w:guid w:val="{C21793DE-B5D2-4059-9D55-BAB874D1249A}"/>
       </w:docPartPr>
       <w:docPartBody>
         <w:p>
           <w:pPr>
-            <w:pStyle w:val="C20C8B319277421EB530D9588D2715C0"/>
+            <w:pStyle w:val="2B3BF47EF2D44E97A0B3C672BD025E58"/>
           </w:pPr>
           <w:r>
             <w:rPr>
@@ -15234,7 +13824,7 @@
     </w:docPart>
     <w:docPart>
       <w:docPartPr>
-        <w:name w:val="BC507A04786F47668FFA501EA4117FE2"/>
+        <w:name w:val="665B63C8A4C8412D812DF9BC59BEE7D1"/>
         <w:category>
           <w:name w:val="Geral"/>
           <w:gallery w:val="placeholder"/>
@@ -15245,12 +13835,12 @@
         <w:behaviors>
           <w:behavior w:val="content"/>
         </w:behaviors>
-        <w:guid w:val="{7A7CC7AE-B957-47E1-856F-CE83B18E3ED8}"/>
+        <w:guid w:val="{B2D749F2-A53F-416F-A91C-E5A978404788}"/>
       </w:docPartPr>
       <w:docPartBody>
         <w:p>
           <w:pPr>
-            <w:pStyle w:val="BC507A04786F47668FFA501EA4117FE2"/>
+            <w:pStyle w:val="665B63C8A4C8412D812DF9BC59BEE7D1"/>
           </w:pPr>
           <w:r>
             <w:rPr>
@@ -15263,7 +13853,7 @@
     </w:docPart>
     <w:docPart>
       <w:docPartPr>
-        <w:name w:val="0BB0F6587CA043049F19E0352BD70015"/>
+        <w:name w:val="9A17C81155104F6AB0B1E948D500FE05"/>
         <w:category>
           <w:name w:val="Geral"/>
           <w:gallery w:val="placeholder"/>
@@ -15274,244 +13864,12 @@
         <w:behaviors>
           <w:behavior w:val="content"/>
         </w:behaviors>
-        <w:guid w:val="{A7D7EEA4-7EAC-4088-BAA4-A88172A69B4E}"/>
+        <w:guid w:val="{9D1466CB-9D8B-4B0D-B3BE-EA850E53E2A6}"/>
       </w:docPartPr>
       <w:docPartBody>
         <w:p>
           <w:pPr>
-            <w:pStyle w:val="0BB0F6587CA043049F19E0352BD70015"/>
-          </w:pPr>
-          <w:r>
-            <w:rPr>
-              <w:rStyle w:val="TextodoEspaoReservado"/>
-            </w:rPr>
-            <w:t>Escolher um item.</w:t>
-          </w:r>
-        </w:p>
-      </w:docPartBody>
-    </w:docPart>
-    <w:docPart>
-      <w:docPartPr>
-        <w:name w:val="1BAAE7C0774C44EABB0D3E48A4BF71C4"/>
-        <w:category>
-          <w:name w:val="Geral"/>
-          <w:gallery w:val="placeholder"/>
-        </w:category>
-        <w:types>
-          <w:type w:val="bbPlcHdr"/>
-        </w:types>
-        <w:behaviors>
-          <w:behavior w:val="content"/>
-        </w:behaviors>
-        <w:guid w:val="{BE296C58-0DC7-4976-98F5-FC7778EBBAA9}"/>
-      </w:docPartPr>
-      <w:docPartBody>
-        <w:p>
-          <w:pPr>
-            <w:pStyle w:val="1BAAE7C0774C44EABB0D3E48A4BF71C4"/>
-          </w:pPr>
-          <w:r>
-            <w:rPr>
-              <w:rStyle w:val="TextodoEspaoReservado"/>
-            </w:rPr>
-            <w:t>Escolher um item.</w:t>
-          </w:r>
-        </w:p>
-      </w:docPartBody>
-    </w:docPart>
-    <w:docPart>
-      <w:docPartPr>
-        <w:name w:val="65CDE118BA6643DEBDD8A17E1B137ADA"/>
-        <w:category>
-          <w:name w:val="Geral"/>
-          <w:gallery w:val="placeholder"/>
-        </w:category>
-        <w:types>
-          <w:type w:val="bbPlcHdr"/>
-        </w:types>
-        <w:behaviors>
-          <w:behavior w:val="content"/>
-        </w:behaviors>
-        <w:guid w:val="{B8215DAB-B998-45B1-B982-85BFE9E9A51E}"/>
-      </w:docPartPr>
-      <w:docPartBody>
-        <w:p>
-          <w:pPr>
-            <w:pStyle w:val="65CDE118BA6643DEBDD8A17E1B137ADA"/>
-          </w:pPr>
-          <w:r>
-            <w:rPr>
-              <w:rStyle w:val="TextodoEspaoReservado"/>
-            </w:rPr>
-            <w:t>Escolher um item.</w:t>
-          </w:r>
-        </w:p>
-      </w:docPartBody>
-    </w:docPart>
-    <w:docPart>
-      <w:docPartPr>
-        <w:name w:val="DB6571CB87B142BE9E8173EF8B56B5AA"/>
-        <w:category>
-          <w:name w:val="Geral"/>
-          <w:gallery w:val="placeholder"/>
-        </w:category>
-        <w:types>
-          <w:type w:val="bbPlcHdr"/>
-        </w:types>
-        <w:behaviors>
-          <w:behavior w:val="content"/>
-        </w:behaviors>
-        <w:guid w:val="{18475D74-56AF-4908-8BD1-F84D0DDD8A3F}"/>
-      </w:docPartPr>
-      <w:docPartBody>
-        <w:p>
-          <w:pPr>
-            <w:pStyle w:val="DB6571CB87B142BE9E8173EF8B56B5AA"/>
-          </w:pPr>
-          <w:r>
-            <w:rPr>
-              <w:rStyle w:val="TextodoEspaoReservado"/>
-            </w:rPr>
-            <w:t>Escolher um item.</w:t>
-          </w:r>
-        </w:p>
-      </w:docPartBody>
-    </w:docPart>
-    <w:docPart>
-      <w:docPartPr>
-        <w:name w:val="486B105B676940EF81049EA457D96BFA"/>
-        <w:category>
-          <w:name w:val="Geral"/>
-          <w:gallery w:val="placeholder"/>
-        </w:category>
-        <w:types>
-          <w:type w:val="bbPlcHdr"/>
-        </w:types>
-        <w:behaviors>
-          <w:behavior w:val="content"/>
-        </w:behaviors>
-        <w:guid w:val="{07158D19-1C4F-442B-943F-F79295559F4A}"/>
-      </w:docPartPr>
-      <w:docPartBody>
-        <w:p>
-          <w:pPr>
-            <w:pStyle w:val="486B105B676940EF81049EA457D96BFA"/>
-          </w:pPr>
-          <w:r>
-            <w:rPr>
-              <w:rStyle w:val="TextodoEspaoReservado"/>
-            </w:rPr>
-            <w:t>Escolher um item.</w:t>
-          </w:r>
-        </w:p>
-      </w:docPartBody>
-    </w:docPart>
-    <w:docPart>
-      <w:docPartPr>
-        <w:name w:val="1AE3EC2271F740BABE7C8F2B3C8F6D7F"/>
-        <w:category>
-          <w:name w:val="Geral"/>
-          <w:gallery w:val="placeholder"/>
-        </w:category>
-        <w:types>
-          <w:type w:val="bbPlcHdr"/>
-        </w:types>
-        <w:behaviors>
-          <w:behavior w:val="content"/>
-        </w:behaviors>
-        <w:guid w:val="{C71A08D8-7A14-4D16-9736-291145D69376}"/>
-      </w:docPartPr>
-      <w:docPartBody>
-        <w:p>
-          <w:pPr>
-            <w:pStyle w:val="1AE3EC2271F740BABE7C8F2B3C8F6D7F"/>
-          </w:pPr>
-          <w:r>
-            <w:rPr>
-              <w:rStyle w:val="TextodoEspaoReservado"/>
-            </w:rPr>
-            <w:t>Escolher um item.</w:t>
-          </w:r>
-        </w:p>
-      </w:docPartBody>
-    </w:docPart>
-    <w:docPart>
-      <w:docPartPr>
-        <w:name w:val="E07D092EB28949BDB47B7D260C32E35A"/>
-        <w:category>
-          <w:name w:val="Geral"/>
-          <w:gallery w:val="placeholder"/>
-        </w:category>
-        <w:types>
-          <w:type w:val="bbPlcHdr"/>
-        </w:types>
-        <w:behaviors>
-          <w:behavior w:val="content"/>
-        </w:behaviors>
-        <w:guid w:val="{64F95056-FF81-4DCD-AFA8-C7B254BBD676}"/>
-      </w:docPartPr>
-      <w:docPartBody>
-        <w:p>
-          <w:pPr>
-            <w:pStyle w:val="E07D092EB28949BDB47B7D260C32E35A"/>
-          </w:pPr>
-          <w:r>
-            <w:rPr>
-              <w:rStyle w:val="TextodoEspaoReservado"/>
-            </w:rPr>
-            <w:t>Escolher um item.</w:t>
-          </w:r>
-        </w:p>
-      </w:docPartBody>
-    </w:docPart>
-    <w:docPart>
-      <w:docPartPr>
-        <w:name w:val="E07DFA7586A54E4FBF6739BA0103AA24"/>
-        <w:category>
-          <w:name w:val="Geral"/>
-          <w:gallery w:val="placeholder"/>
-        </w:category>
-        <w:types>
-          <w:type w:val="bbPlcHdr"/>
-        </w:types>
-        <w:behaviors>
-          <w:behavior w:val="content"/>
-        </w:behaviors>
-        <w:guid w:val="{254E1F61-21D8-41C7-82FF-B304E5B0423F}"/>
-      </w:docPartPr>
-      <w:docPartBody>
-        <w:p>
-          <w:pPr>
-            <w:pStyle w:val="E07DFA7586A54E4FBF6739BA0103AA24"/>
-          </w:pPr>
-          <w:r>
-            <w:rPr>
-              <w:rStyle w:val="TextodoEspaoReservado"/>
-            </w:rPr>
-            <w:t>Escolher um item.</w:t>
-          </w:r>
-        </w:p>
-      </w:docPartBody>
-    </w:docPart>
-    <w:docPart>
-      <w:docPartPr>
-        <w:name w:val="555918F2349547278B6B8F7F95BDD5F0"/>
-        <w:category>
-          <w:name w:val="Geral"/>
-          <w:gallery w:val="placeholder"/>
-        </w:category>
-        <w:types>
-          <w:type w:val="bbPlcHdr"/>
-        </w:types>
-        <w:behaviors>
-          <w:behavior w:val="content"/>
-        </w:behaviors>
-        <w:guid w:val="{5F795D6D-05CB-4689-AE24-424EEFD1D30F}"/>
-      </w:docPartPr>
-      <w:docPartBody>
-        <w:p>
-          <w:pPr>
-            <w:pStyle w:val="555918F2349547278B6B8F7F95BDD5F0"/>
+            <w:pStyle w:val="9A17C81155104F6AB0B1E948D500FE05"/>
           </w:pPr>
           <w:r>
             <w:rPr>
@@ -15623,13 +13981,24 @@
   </w:compat>
   <w:rsids>
     <w:rsidRoot w:val="00777EF8"/>
+    <w:rsid w:val="000C40AD"/>
+    <w:rsid w:val="001704EB"/>
+    <w:rsid w:val="003337C2"/>
+    <w:rsid w:val="003D03B6"/>
     <w:rsid w:val="004F7115"/>
+    <w:rsid w:val="005238B4"/>
     <w:rsid w:val="00544863"/>
     <w:rsid w:val="005D3323"/>
+    <w:rsid w:val="006D5118"/>
+    <w:rsid w:val="007659BD"/>
     <w:rsid w:val="00777EF8"/>
     <w:rsid w:val="00820C96"/>
     <w:rsid w:val="00990D8F"/>
+    <w:rsid w:val="009B4ADE"/>
+    <w:rsid w:val="00A36748"/>
     <w:rsid w:val="00A54E8F"/>
+    <w:rsid w:val="00B37006"/>
+    <w:rsid w:val="00B82E57"/>
     <w:rsid w:val="00C24D31"/>
     <w:rsid w:val="00C42C71"/>
     <w:rsid w:val="00C9731F"/>
@@ -15637,6 +14006,7 @@
     <w:rsid w:val="00E70214"/>
     <w:rsid w:val="00EA697A"/>
     <w:rsid w:val="00F25951"/>
+    <w:rsid w:val="00FC2E03"/>
   </w:rsids>
   <m:mathPr>
     <m:mathFont m:val="Cambria Math"/>
@@ -16092,7 +14462,7 @@
     <w:basedOn w:val="Fontepargpadro"/>
     <w:uiPriority w:val="99"/>
     <w:semiHidden/>
-    <w:rsid w:val="00777EF8"/>
+    <w:rsid w:val="006D5118"/>
     <w:rPr>
       <w:color w:val="808080"/>
     </w:rPr>
@@ -16145,53 +14515,21 @@
     <w:name w:val="F81731A67EC8408C9492E1DDB0ADA92A"/>
     <w:rsid w:val="00777EF8"/>
   </w:style>
-  <w:style w:type="paragraph" w:customStyle="1" w:styleId="C01BA29ABC29466688E938D784992E30">
-    <w:name w:val="C01BA29ABC29466688E938D784992E30"/>
-    <w:rsid w:val="00777EF8"/>
-  </w:style>
-  <w:style w:type="paragraph" w:customStyle="1" w:styleId="C20C8B319277421EB530D9588D2715C0">
-    <w:name w:val="C20C8B319277421EB530D9588D2715C0"/>
-    <w:rsid w:val="00777EF8"/>
-  </w:style>
-  <w:style w:type="paragraph" w:customStyle="1" w:styleId="BC507A04786F47668FFA501EA4117FE2">
-    <w:name w:val="BC507A04786F47668FFA501EA4117FE2"/>
-    <w:rsid w:val="00777EF8"/>
-  </w:style>
-  <w:style w:type="paragraph" w:customStyle="1" w:styleId="0BB0F6587CA043049F19E0352BD70015">
-    <w:name w:val="0BB0F6587CA043049F19E0352BD70015"/>
-    <w:rsid w:val="00777EF8"/>
-  </w:style>
-  <w:style w:type="paragraph" w:customStyle="1" w:styleId="1BAAE7C0774C44EABB0D3E48A4BF71C4">
-    <w:name w:val="1BAAE7C0774C44EABB0D3E48A4BF71C4"/>
-    <w:rsid w:val="00777EF8"/>
-  </w:style>
-  <w:style w:type="paragraph" w:customStyle="1" w:styleId="65CDE118BA6643DEBDD8A17E1B137ADA">
-    <w:name w:val="65CDE118BA6643DEBDD8A17E1B137ADA"/>
-    <w:rsid w:val="00777EF8"/>
-  </w:style>
-  <w:style w:type="paragraph" w:customStyle="1" w:styleId="DB6571CB87B142BE9E8173EF8B56B5AA">
-    <w:name w:val="DB6571CB87B142BE9E8173EF8B56B5AA"/>
-    <w:rsid w:val="00777EF8"/>
-  </w:style>
-  <w:style w:type="paragraph" w:customStyle="1" w:styleId="486B105B676940EF81049EA457D96BFA">
-    <w:name w:val="486B105B676940EF81049EA457D96BFA"/>
-    <w:rsid w:val="00777EF8"/>
-  </w:style>
-  <w:style w:type="paragraph" w:customStyle="1" w:styleId="1AE3EC2271F740BABE7C8F2B3C8F6D7F">
-    <w:name w:val="1AE3EC2271F740BABE7C8F2B3C8F6D7F"/>
-    <w:rsid w:val="00777EF8"/>
-  </w:style>
-  <w:style w:type="paragraph" w:customStyle="1" w:styleId="E07D092EB28949BDB47B7D260C32E35A">
-    <w:name w:val="E07D092EB28949BDB47B7D260C32E35A"/>
-    <w:rsid w:val="00777EF8"/>
-  </w:style>
-  <w:style w:type="paragraph" w:customStyle="1" w:styleId="E07DFA7586A54E4FBF6739BA0103AA24">
-    <w:name w:val="E07DFA7586A54E4FBF6739BA0103AA24"/>
-    <w:rsid w:val="00777EF8"/>
-  </w:style>
-  <w:style w:type="paragraph" w:customStyle="1" w:styleId="555918F2349547278B6B8F7F95BDD5F0">
-    <w:name w:val="555918F2349547278B6B8F7F95BDD5F0"/>
-    <w:rsid w:val="00777EF8"/>
+  <w:style w:type="paragraph" w:customStyle="1" w:styleId="5833024B207F4EFD8792C8948A368941">
+    <w:name w:val="5833024B207F4EFD8792C8948A368941"/>
+    <w:rsid w:val="006D5118"/>
+  </w:style>
+  <w:style w:type="paragraph" w:customStyle="1" w:styleId="2B3BF47EF2D44E97A0B3C672BD025E58">
+    <w:name w:val="2B3BF47EF2D44E97A0B3C672BD025E58"/>
+    <w:rsid w:val="006D5118"/>
+  </w:style>
+  <w:style w:type="paragraph" w:customStyle="1" w:styleId="665B63C8A4C8412D812DF9BC59BEE7D1">
+    <w:name w:val="665B63C8A4C8412D812DF9BC59BEE7D1"/>
+    <w:rsid w:val="006D5118"/>
+  </w:style>
+  <w:style w:type="paragraph" w:customStyle="1" w:styleId="9A17C81155104F6AB0B1E948D500FE05">
+    <w:name w:val="9A17C81155104F6AB0B1E948D500FE05"/>
+    <w:rsid w:val="006D5118"/>
   </w:style>
 </w:styles>
 </file>
@@ -16492,28 +14830,28 @@
 </file>
 
 <file path=customXml/item1.xml><?xml version="1.0" encoding="utf-8"?>
-<b:Sources xmlns:b="http://schemas.openxmlformats.org/officeDocument/2006/bibliography" xmlns="http://schemas.openxmlformats.org/officeDocument/2006/bibliography" SelectedStyle="\APASixthEditionOfficeOnline.xsl" StyleName="APA" Version="6"/>
-</file>
-
-<file path=customXml/item2.xml><?xml version="1.0" encoding="utf-8"?>
 <go:gDocsCustomXmlDataStorage xmlns:go="http://customooxmlschemas.google.com/" xmlns:r="http://schemas.openxmlformats.org/officeDocument/2006/relationships">
   <go:docsCustomData xmlns:go="http://customooxmlschemas.google.com/" roundtripDataSignature="AMtx7mireC5jhx61ZFx9QXGA77WyrFMjeQ==">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</go:docsCustomData>
 </go:gDocsCustomXmlDataStorage>
 </file>
 
-<file path=customXml/itemProps1.xml><?xml version="1.0" encoding="utf-8"?>
-<ds:datastoreItem xmlns:ds="http://schemas.openxmlformats.org/officeDocument/2006/customXml" ds:itemID="{ECDF6E07-8575-48BF-9B74-55682B433C56}">
-  <ds:schemaRefs>
-    <ds:schemaRef ds:uri="http://schemas.openxmlformats.org/officeDocument/2006/bibliography"/>
-  </ds:schemaRefs>
-</ds:datastoreItem>
+<file path=customXml/item2.xml><?xml version="1.0" encoding="utf-8"?>
+<b:Sources xmlns:b="http://schemas.openxmlformats.org/officeDocument/2006/bibliography" xmlns="http://schemas.openxmlformats.org/officeDocument/2006/bibliography" SelectedStyle="\APASixthEditionOfficeOnline.xsl" StyleName="APA" Version="6"/>
 </file>
 
-<file path=customXml/itemProps2.xml><?xml version="1.0" encoding="utf-8"?>
+<file path=customXml/itemProps1.xml><?xml version="1.0" encoding="utf-8"?>
 <ds:datastoreItem xmlns:ds="http://schemas.openxmlformats.org/officeDocument/2006/customXml" ds:itemID="{11111111-1234-1234-1234-123412341234}">
   <ds:schemaRefs>
     <ds:schemaRef ds:uri="http://customooxmlschemas.google.com/"/>
     <ds:schemaRef ds:uri="http://schemas.openxmlformats.org/officeDocument/2006/relationships"/>
   </ds:schemaRefs>
 </ds:datastoreItem>
+</file>
+
+<file path=customXml/itemProps2.xml><?xml version="1.0" encoding="utf-8"?>
+<ds:datastoreItem xmlns:ds="http://schemas.openxmlformats.org/officeDocument/2006/customXml" ds:itemID="{ECDF6E07-8575-48BF-9B74-55682B433C56}">
+  <ds:schemaRefs>
+    <ds:schemaRef ds:uri="http://schemas.openxmlformats.org/officeDocument/2006/bibliography"/>
+  </ds:schemaRefs>
+</ds:datastoreItem>
 </file>
</xml_diff>